<commit_message>
Organize project docs and add report generation assets
</commit_message>
<xml_diff>
--- a/project_report.docx
+++ b/project_report.docx
@@ -9901,6 +9901,3304 @@
           <w:sz w:val="32"/>
         </w:rPr>
         <w:t>Regression Test = การทดสอบซ้ำเพื่อป้องกันปัญหาที่กลับมาเกิดอีกหลังแก้ไขโค้ด</w:t>
+      </w:r>
+    </w:p>
+    <w:p>
+      <w:pPr>
+        <w:keepNext/>
+        <w:keepLines w:val="0"/>
+        <w:spacing w:before="80" w:after="40" w:line="240" w:lineRule="auto"/>
+        <w:ind w:left="425" w:right="0" w:firstLine="0"/>
+        <w:jc w:val="left"/>
+      </w:pPr>
+      <w:r>
+        <w:rPr>
+          <w:rFonts w:ascii="TH Sarabun New" w:hAnsi="TH Sarabun New" w:eastAsia="TH Sarabun New"/>
+          <w:b/>
+          <w:sz w:val="32"/>
+        </w:rPr>
+        <w:t>ภาคผนวก ช คู่มือการใช้งานระบบ MCOT Equipment Service</w:t>
+      </w:r>
+    </w:p>
+    <w:p>
+      <w:pPr>
+        <w:keepNext/>
+        <w:keepLines w:val="0"/>
+        <w:spacing w:before="80" w:after="40" w:line="240" w:lineRule="auto"/>
+        <w:ind w:left="425" w:right="0" w:firstLine="0"/>
+        <w:jc w:val="left"/>
+      </w:pPr>
+      <w:r>
+        <w:rPr>
+          <w:rFonts w:ascii="TH Sarabun New" w:hAnsi="TH Sarabun New" w:eastAsia="TH Sarabun New"/>
+          <w:b/>
+          <w:sz w:val="32"/>
+        </w:rPr>
+        <w:t>ช.1 ภาพรวมระบบ</w:t>
+      </w:r>
+    </w:p>
+    <w:p>
+      <w:pPr>
+        <w:keepNext w:val="0"/>
+        <w:keepLines w:val="0"/>
+        <w:spacing w:before="0" w:after="0" w:line="240" w:lineRule="auto"/>
+        <w:ind w:left="0" w:right="0" w:firstLine="709"/>
+        <w:jc w:val="thaiDistribute"/>
+      </w:pPr>
+      <w:r>
+        <w:rPr>
+          <w:rFonts w:ascii="TH Sarabun New" w:hAnsi="TH Sarabun New" w:eastAsia="TH Sarabun New"/>
+          <w:b w:val="0"/>
+          <w:sz w:val="32"/>
+        </w:rPr>
+        <w:t>MCOT Equipment Service เป็นระบบสำหรับบริหารการเช่าอุปกรณ์ สตูดิโอ แพ็กเกจ และบริการที่เกี่ยวข้องกับงานผลิตสื่อ โดยรองรับการทำงานตั้งแต่การเลือกทรัพยากร การตรวจสอบความพร้อมใช้งาน การสร้างรายการจอง การแนบหลักฐานการชำระเงิน การอนุมัติจากเจ้าหน้าที่ ตลอดจนการติดตามสถานะและการจัดทำเอกสารประกอบ</w:t>
+      </w:r>
+    </w:p>
+    <w:p>
+      <w:pPr>
+        <w:keepNext w:val="0"/>
+        <w:keepLines w:val="0"/>
+        <w:spacing w:before="0" w:after="0" w:line="240" w:lineRule="auto"/>
+        <w:ind w:left="0" w:right="0" w:firstLine="709"/>
+        <w:jc w:val="thaiDistribute"/>
+      </w:pPr>
+      <w:r>
+        <w:rPr>
+          <w:rFonts w:ascii="TH Sarabun New" w:hAnsi="TH Sarabun New" w:eastAsia="TH Sarabun New"/>
+          <w:b w:val="0"/>
+          <w:sz w:val="32"/>
+        </w:rPr>
+        <w:t>คุณสมบัติสำคัญของระบบ</w:t>
+      </w:r>
+    </w:p>
+    <w:p>
+      <w:pPr>
+        <w:keepNext w:val="0"/>
+        <w:keepLines w:val="0"/>
+        <w:spacing w:before="0" w:after="0" w:line="240" w:lineRule="auto"/>
+        <w:ind w:left="425" w:right="0" w:hanging="283"/>
+        <w:jc w:val="left"/>
+      </w:pPr>
+      <w:r>
+        <w:rPr>
+          <w:rFonts w:ascii="TH Sarabun New" w:hAnsi="TH Sarabun New" w:eastAsia="TH Sarabun New"/>
+          <w:b w:val="0"/>
+          <w:sz w:val="32"/>
+        </w:rPr>
+        <w:t xml:space="preserve">1. </w:t>
+      </w:r>
+      <w:r>
+        <w:rPr>
+          <w:rFonts w:ascii="TH Sarabun New" w:hAnsi="TH Sarabun New" w:eastAsia="TH Sarabun New"/>
+          <w:b w:val="0"/>
+          <w:sz w:val="32"/>
+        </w:rPr>
+        <w:t>ค้นหาอุปกรณ์และบริการจากหน้าแคตตาล็อกได้สะดวก</w:t>
+      </w:r>
+    </w:p>
+    <w:p>
+      <w:pPr>
+        <w:keepNext w:val="0"/>
+        <w:keepLines w:val="0"/>
+        <w:spacing w:before="0" w:after="0" w:line="240" w:lineRule="auto"/>
+        <w:ind w:left="425" w:right="0" w:hanging="283"/>
+        <w:jc w:val="left"/>
+      </w:pPr>
+      <w:r>
+        <w:rPr>
+          <w:rFonts w:ascii="TH Sarabun New" w:hAnsi="TH Sarabun New" w:eastAsia="TH Sarabun New"/>
+          <w:b w:val="0"/>
+          <w:sz w:val="32"/>
+        </w:rPr>
+        <w:t xml:space="preserve">2. </w:t>
+      </w:r>
+      <w:r>
+        <w:rPr>
+          <w:rFonts w:ascii="TH Sarabun New" w:hAnsi="TH Sarabun New" w:eastAsia="TH Sarabun New"/>
+          <w:b w:val="0"/>
+          <w:sz w:val="32"/>
+        </w:rPr>
+        <w:t>เพิ่มรายการลงตะกร้าและเลือกวันใช้งานได้ในขั้นตอนเดียวกัน</w:t>
+      </w:r>
+    </w:p>
+    <w:p>
+      <w:pPr>
+        <w:keepNext w:val="0"/>
+        <w:keepLines w:val="0"/>
+        <w:spacing w:before="0" w:after="0" w:line="240" w:lineRule="auto"/>
+        <w:ind w:left="425" w:right="0" w:hanging="283"/>
+        <w:jc w:val="left"/>
+      </w:pPr>
+      <w:r>
+        <w:rPr>
+          <w:rFonts w:ascii="TH Sarabun New" w:hAnsi="TH Sarabun New" w:eastAsia="TH Sarabun New"/>
+          <w:b w:val="0"/>
+          <w:sz w:val="32"/>
+        </w:rPr>
+        <w:t xml:space="preserve">3. </w:t>
+      </w:r>
+      <w:r>
+        <w:rPr>
+          <w:rFonts w:ascii="TH Sarabun New" w:hAnsi="TH Sarabun New" w:eastAsia="TH Sarabun New"/>
+          <w:b w:val="0"/>
+          <w:sz w:val="32"/>
+        </w:rPr>
+        <w:t>ตรวจสอบความพร้อมใช้งานของทรัพยากรได้ก่อนยืนยันการจอง</w:t>
+      </w:r>
+    </w:p>
+    <w:p>
+      <w:pPr>
+        <w:keepNext w:val="0"/>
+        <w:keepLines w:val="0"/>
+        <w:spacing w:before="0" w:after="0" w:line="240" w:lineRule="auto"/>
+        <w:ind w:left="425" w:right="0" w:hanging="283"/>
+        <w:jc w:val="left"/>
+      </w:pPr>
+      <w:r>
+        <w:rPr>
+          <w:rFonts w:ascii="TH Sarabun New" w:hAnsi="TH Sarabun New" w:eastAsia="TH Sarabun New"/>
+          <w:b w:val="0"/>
+          <w:sz w:val="32"/>
+        </w:rPr>
+        <w:t xml:space="preserve">4. </w:t>
+      </w:r>
+      <w:r>
+        <w:rPr>
+          <w:rFonts w:ascii="TH Sarabun New" w:hAnsi="TH Sarabun New" w:eastAsia="TH Sarabun New"/>
+          <w:b w:val="0"/>
+          <w:sz w:val="32"/>
+        </w:rPr>
+        <w:t>รองรับการติดตามสถานะรายการจองของผู้ใช้แต่ละราย</w:t>
+      </w:r>
+    </w:p>
+    <w:p>
+      <w:pPr>
+        <w:keepNext w:val="0"/>
+        <w:keepLines w:val="0"/>
+        <w:spacing w:before="0" w:after="0" w:line="240" w:lineRule="auto"/>
+        <w:ind w:left="425" w:right="0" w:hanging="283"/>
+        <w:jc w:val="left"/>
+      </w:pPr>
+      <w:r>
+        <w:rPr>
+          <w:rFonts w:ascii="TH Sarabun New" w:hAnsi="TH Sarabun New" w:eastAsia="TH Sarabun New"/>
+          <w:b w:val="0"/>
+          <w:sz w:val="32"/>
+        </w:rPr>
+        <w:t xml:space="preserve">5. </w:t>
+      </w:r>
+      <w:r>
+        <w:rPr>
+          <w:rFonts w:ascii="TH Sarabun New" w:hAnsi="TH Sarabun New" w:eastAsia="TH Sarabun New"/>
+          <w:b w:val="0"/>
+          <w:sz w:val="32"/>
+        </w:rPr>
+        <w:t>มีหน้าปฏิบัติการสำหรับเจ้าหน้าที่ในการอนุมัติและจัดการรายการ</w:t>
+      </w:r>
+    </w:p>
+    <w:p>
+      <w:pPr>
+        <w:keepNext w:val="0"/>
+        <w:keepLines w:val="0"/>
+        <w:spacing w:before="0" w:after="0" w:line="240" w:lineRule="auto"/>
+        <w:ind w:left="425" w:right="0" w:hanging="283"/>
+        <w:jc w:val="left"/>
+      </w:pPr>
+      <w:r>
+        <w:rPr>
+          <w:rFonts w:ascii="TH Sarabun New" w:hAnsi="TH Sarabun New" w:eastAsia="TH Sarabun New"/>
+          <w:b w:val="0"/>
+          <w:sz w:val="32"/>
+        </w:rPr>
+        <w:t xml:space="preserve">6. </w:t>
+      </w:r>
+      <w:r>
+        <w:rPr>
+          <w:rFonts w:ascii="TH Sarabun New" w:hAnsi="TH Sarabun New" w:eastAsia="TH Sarabun New"/>
+          <w:b w:val="0"/>
+          <w:sz w:val="32"/>
+        </w:rPr>
+        <w:t>สามารถสร้างเอกสาร PDF ที่เกี่ยวข้องกับรายการจองได้</w:t>
+      </w:r>
+    </w:p>
+    <w:p>
+      <w:pPr>
+        <w:keepNext/>
+        <w:keepLines w:val="0"/>
+        <w:spacing w:before="80" w:after="40" w:line="240" w:lineRule="auto"/>
+        <w:ind w:left="425" w:right="0" w:firstLine="0"/>
+        <w:jc w:val="left"/>
+      </w:pPr>
+      <w:r>
+        <w:rPr>
+          <w:rFonts w:ascii="TH Sarabun New" w:hAnsi="TH Sarabun New" w:eastAsia="TH Sarabun New"/>
+          <w:b/>
+          <w:sz w:val="32"/>
+        </w:rPr>
+        <w:t>ช.2 บทบาทของผู้ใช้งาน</w:t>
+      </w:r>
+    </w:p>
+    <w:p>
+      <w:pPr>
+        <w:keepNext w:val="0"/>
+        <w:keepLines w:val="0"/>
+        <w:spacing w:before="0" w:after="0" w:line="240" w:lineRule="auto"/>
+        <w:ind w:left="0" w:right="0" w:firstLine="709"/>
+        <w:jc w:val="thaiDistribute"/>
+      </w:pPr>
+      <w:r>
+        <w:rPr>
+          <w:rFonts w:ascii="TH Sarabun New" w:hAnsi="TH Sarabun New" w:eastAsia="TH Sarabun New"/>
+          <w:b w:val="0"/>
+          <w:sz w:val="32"/>
+        </w:rPr>
+        <w:t>**ลูกค้า**: สามารถสมัครสมาชิก เข้าสู่ระบบ ค้นหาอุปกรณ์ เลือกวันเช่า สร้างรายการจอง และติดตามสถานะของรายการตนเอง</w:t>
+      </w:r>
+    </w:p>
+    <w:p>
+      <w:pPr>
+        <w:keepNext w:val="0"/>
+        <w:keepLines w:val="0"/>
+        <w:spacing w:before="0" w:after="0" w:line="240" w:lineRule="auto"/>
+        <w:ind w:left="0" w:right="0" w:firstLine="709"/>
+        <w:jc w:val="thaiDistribute"/>
+      </w:pPr>
+      <w:r>
+        <w:rPr>
+          <w:rFonts w:ascii="TH Sarabun New" w:hAnsi="TH Sarabun New" w:eastAsia="TH Sarabun New"/>
+          <w:b w:val="0"/>
+          <w:sz w:val="32"/>
+        </w:rPr>
+        <w:t>**เจ้าหน้าที่**: สามารถเข้าดูหน้าปฏิบัติการ ตรวจสอบรายการใหม่ อนุมัติรายการ เปลี่ยนสถานะ และดูข้อมูลสรุปที่เกี่ยวข้อง</w:t>
+      </w:r>
+    </w:p>
+    <w:p>
+      <w:pPr>
+        <w:keepNext w:val="0"/>
+        <w:keepLines w:val="0"/>
+        <w:spacing w:before="0" w:after="0" w:line="240" w:lineRule="auto"/>
+        <w:ind w:left="0" w:right="0" w:firstLine="709"/>
+        <w:jc w:val="thaiDistribute"/>
+      </w:pPr>
+      <w:r>
+        <w:rPr>
+          <w:rFonts w:ascii="TH Sarabun New" w:hAnsi="TH Sarabun New" w:eastAsia="TH Sarabun New"/>
+          <w:b w:val="0"/>
+          <w:sz w:val="32"/>
+        </w:rPr>
+        <w:t>**ผู้ดูแลระบบ**: มีหน้าที่ดูแลข้อมูลตั้งต้น ตรวจสอบความพร้อมของระบบ นำระบบขึ้นใช้งานจริง และดูแลกรณีฉุกเฉิน</w:t>
+      </w:r>
+    </w:p>
+    <w:p>
+      <w:pPr>
+        <w:keepNext/>
+        <w:keepLines w:val="0"/>
+        <w:spacing w:before="80" w:after="40" w:line="240" w:lineRule="auto"/>
+        <w:ind w:left="425" w:right="0" w:firstLine="0"/>
+        <w:jc w:val="left"/>
+      </w:pPr>
+      <w:r>
+        <w:rPr>
+          <w:rFonts w:ascii="TH Sarabun New" w:hAnsi="TH Sarabun New" w:eastAsia="TH Sarabun New"/>
+          <w:b/>
+          <w:sz w:val="32"/>
+        </w:rPr>
+        <w:t>ช.3 คู่มือสำหรับลูกค้า</w:t>
+      </w:r>
+    </w:p>
+    <w:p>
+      <w:pPr>
+        <w:keepNext w:val="0"/>
+        <w:keepLines w:val="0"/>
+        <w:spacing w:before="0" w:after="0" w:line="240" w:lineRule="auto"/>
+        <w:ind w:left="0" w:right="0" w:firstLine="709"/>
+        <w:jc w:val="thaiDistribute"/>
+      </w:pPr>
+      <w:r>
+        <w:rPr>
+          <w:rFonts w:ascii="TH Sarabun New" w:hAnsi="TH Sarabun New" w:eastAsia="TH Sarabun New"/>
+          <w:b w:val="0"/>
+          <w:sz w:val="32"/>
+        </w:rPr>
+        <w:t>**การเข้าสู่ระบบ**</w:t>
+      </w:r>
+    </w:p>
+    <w:p>
+      <w:pPr>
+        <w:keepNext w:val="0"/>
+        <w:keepLines w:val="0"/>
+        <w:spacing w:before="0" w:after="0" w:line="240" w:lineRule="auto"/>
+        <w:ind w:left="425" w:right="0" w:hanging="283"/>
+        <w:jc w:val="left"/>
+      </w:pPr>
+      <w:r>
+        <w:rPr>
+          <w:rFonts w:ascii="TH Sarabun New" w:hAnsi="TH Sarabun New" w:eastAsia="TH Sarabun New"/>
+          <w:b w:val="0"/>
+          <w:sz w:val="32"/>
+        </w:rPr>
+        <w:t xml:space="preserve">1. </w:t>
+      </w:r>
+      <w:r>
+        <w:rPr>
+          <w:rFonts w:ascii="TH Sarabun New" w:hAnsi="TH Sarabun New" w:eastAsia="TH Sarabun New"/>
+          <w:b w:val="0"/>
+          <w:sz w:val="32"/>
+        </w:rPr>
+        <w:t>เปิดเว็บไซต์ MCOT Equipment Service</w:t>
+      </w:r>
+    </w:p>
+    <w:p>
+      <w:pPr>
+        <w:keepNext w:val="0"/>
+        <w:keepLines w:val="0"/>
+        <w:spacing w:before="0" w:after="0" w:line="240" w:lineRule="auto"/>
+        <w:ind w:left="425" w:right="0" w:hanging="283"/>
+        <w:jc w:val="left"/>
+      </w:pPr>
+      <w:r>
+        <w:rPr>
+          <w:rFonts w:ascii="TH Sarabun New" w:hAnsi="TH Sarabun New" w:eastAsia="TH Sarabun New"/>
+          <w:b w:val="0"/>
+          <w:sz w:val="32"/>
+        </w:rPr>
+        <w:t xml:space="preserve">2. </w:t>
+      </w:r>
+      <w:r>
+        <w:rPr>
+          <w:rFonts w:ascii="TH Sarabun New" w:hAnsi="TH Sarabun New" w:eastAsia="TH Sarabun New"/>
+          <w:b w:val="0"/>
+          <w:sz w:val="32"/>
+        </w:rPr>
+        <w:t>เลือกเมนูเข้าสู่ระบบหรือสมัครสมาชิก</w:t>
+      </w:r>
+    </w:p>
+    <w:p>
+      <w:pPr>
+        <w:keepNext w:val="0"/>
+        <w:keepLines w:val="0"/>
+        <w:spacing w:before="0" w:after="0" w:line="240" w:lineRule="auto"/>
+        <w:ind w:left="425" w:right="0" w:hanging="283"/>
+        <w:jc w:val="left"/>
+      </w:pPr>
+      <w:r>
+        <w:rPr>
+          <w:rFonts w:ascii="TH Sarabun New" w:hAnsi="TH Sarabun New" w:eastAsia="TH Sarabun New"/>
+          <w:b w:val="0"/>
+          <w:sz w:val="32"/>
+        </w:rPr>
+        <w:t xml:space="preserve">3. </w:t>
+      </w:r>
+      <w:r>
+        <w:rPr>
+          <w:rFonts w:ascii="TH Sarabun New" w:hAnsi="TH Sarabun New" w:eastAsia="TH Sarabun New"/>
+          <w:b w:val="0"/>
+          <w:sz w:val="32"/>
+        </w:rPr>
+        <w:t>กรอกข้อมูลอีเมลและรหัสผ่าน</w:t>
+      </w:r>
+    </w:p>
+    <w:p>
+      <w:pPr>
+        <w:keepNext w:val="0"/>
+        <w:keepLines w:val="0"/>
+        <w:spacing w:before="0" w:after="0" w:line="240" w:lineRule="auto"/>
+        <w:ind w:left="425" w:right="0" w:hanging="283"/>
+        <w:jc w:val="left"/>
+      </w:pPr>
+      <w:r>
+        <w:rPr>
+          <w:rFonts w:ascii="TH Sarabun New" w:hAnsi="TH Sarabun New" w:eastAsia="TH Sarabun New"/>
+          <w:b w:val="0"/>
+          <w:sz w:val="32"/>
+        </w:rPr>
+        <w:t xml:space="preserve">4. </w:t>
+      </w:r>
+      <w:r>
+        <w:rPr>
+          <w:rFonts w:ascii="TH Sarabun New" w:hAnsi="TH Sarabun New" w:eastAsia="TH Sarabun New"/>
+          <w:b w:val="0"/>
+          <w:sz w:val="32"/>
+        </w:rPr>
+        <w:t>สามารถสมัครด้วยอีเมลหรือบัญชี Google</w:t>
+      </w:r>
+    </w:p>
+    <w:p>
+      <w:pPr>
+        <w:keepNext w:val="0"/>
+        <w:keepLines w:val="0"/>
+        <w:spacing w:before="0" w:after="0" w:line="240" w:lineRule="auto"/>
+        <w:ind w:left="425" w:right="0" w:hanging="283"/>
+        <w:jc w:val="left"/>
+      </w:pPr>
+      <w:r>
+        <w:rPr>
+          <w:rFonts w:ascii="TH Sarabun New" w:hAnsi="TH Sarabun New" w:eastAsia="TH Sarabun New"/>
+          <w:b w:val="0"/>
+          <w:sz w:val="32"/>
+        </w:rPr>
+        <w:t xml:space="preserve">5. </w:t>
+      </w:r>
+      <w:r>
+        <w:rPr>
+          <w:rFonts w:ascii="TH Sarabun New" w:hAnsi="TH Sarabun New" w:eastAsia="TH Sarabun New"/>
+          <w:b w:val="0"/>
+          <w:sz w:val="32"/>
+        </w:rPr>
+        <w:t>เมื่อล็อกอินสำเร็จ ตรวจสอบข้อมูลส่วนตัวให้ครบถ้วน</w:t>
+      </w:r>
+    </w:p>
+    <w:p>
+      <w:pPr>
+        <w:keepNext w:val="0"/>
+        <w:keepLines w:val="0"/>
+        <w:spacing w:before="0" w:after="0" w:line="240" w:lineRule="auto"/>
+        <w:ind w:left="0" w:right="0" w:firstLine="709"/>
+        <w:jc w:val="thaiDistribute"/>
+      </w:pPr>
+      <w:r>
+        <w:rPr>
+          <w:rFonts w:ascii="TH Sarabun New" w:hAnsi="TH Sarabun New" w:eastAsia="TH Sarabun New"/>
+          <w:b w:val="0"/>
+          <w:sz w:val="32"/>
+        </w:rPr>
+        <w:t>**การค้นหาอุปกรณ์และบริการ**</w:t>
+      </w:r>
+    </w:p>
+    <w:p>
+      <w:pPr>
+        <w:keepNext w:val="0"/>
+        <w:keepLines w:val="0"/>
+        <w:spacing w:before="0" w:after="0" w:line="240" w:lineRule="auto"/>
+        <w:ind w:left="425" w:right="0" w:hanging="283"/>
+        <w:jc w:val="left"/>
+      </w:pPr>
+      <w:r>
+        <w:rPr>
+          <w:rFonts w:ascii="TH Sarabun New" w:hAnsi="TH Sarabun New" w:eastAsia="TH Sarabun New"/>
+          <w:b w:val="0"/>
+          <w:sz w:val="32"/>
+        </w:rPr>
+        <w:t xml:space="preserve">1. </w:t>
+      </w:r>
+      <w:r>
+        <w:rPr>
+          <w:rFonts w:ascii="TH Sarabun New" w:hAnsi="TH Sarabun New" w:eastAsia="TH Sarabun New"/>
+          <w:b w:val="0"/>
+          <w:sz w:val="32"/>
+        </w:rPr>
+        <w:t>เข้าเมนูแคตตาล็อกสินค้า</w:t>
+      </w:r>
+    </w:p>
+    <w:p>
+      <w:pPr>
+        <w:keepNext w:val="0"/>
+        <w:keepLines w:val="0"/>
+        <w:spacing w:before="0" w:after="0" w:line="240" w:lineRule="auto"/>
+        <w:ind w:left="425" w:right="0" w:hanging="283"/>
+        <w:jc w:val="left"/>
+      </w:pPr>
+      <w:r>
+        <w:rPr>
+          <w:rFonts w:ascii="TH Sarabun New" w:hAnsi="TH Sarabun New" w:eastAsia="TH Sarabun New"/>
+          <w:b w:val="0"/>
+          <w:sz w:val="32"/>
+        </w:rPr>
+        <w:t xml:space="preserve">2. </w:t>
+      </w:r>
+      <w:r>
+        <w:rPr>
+          <w:rFonts w:ascii="TH Sarabun New" w:hAnsi="TH Sarabun New" w:eastAsia="TH Sarabun New"/>
+          <w:b w:val="0"/>
+          <w:sz w:val="32"/>
+        </w:rPr>
+        <w:t>ใช้ช่องค้นหาเพื่อพิมพ์ชื่ออุปกรณ์</w:t>
+      </w:r>
+    </w:p>
+    <w:p>
+      <w:pPr>
+        <w:keepNext w:val="0"/>
+        <w:keepLines w:val="0"/>
+        <w:spacing w:before="0" w:after="0" w:line="240" w:lineRule="auto"/>
+        <w:ind w:left="425" w:right="0" w:hanging="283"/>
+        <w:jc w:val="left"/>
+      </w:pPr>
+      <w:r>
+        <w:rPr>
+          <w:rFonts w:ascii="TH Sarabun New" w:hAnsi="TH Sarabun New" w:eastAsia="TH Sarabun New"/>
+          <w:b w:val="0"/>
+          <w:sz w:val="32"/>
+        </w:rPr>
+        <w:t xml:space="preserve">3. </w:t>
+      </w:r>
+      <w:r>
+        <w:rPr>
+          <w:rFonts w:ascii="TH Sarabun New" w:hAnsi="TH Sarabun New" w:eastAsia="TH Sarabun New"/>
+          <w:b w:val="0"/>
+          <w:sz w:val="32"/>
+        </w:rPr>
+        <w:t>ใช้ตัวกรองเพื่อคัดเลือกหมวดหมู่</w:t>
+      </w:r>
+    </w:p>
+    <w:p>
+      <w:pPr>
+        <w:keepNext w:val="0"/>
+        <w:keepLines w:val="0"/>
+        <w:spacing w:before="0" w:after="0" w:line="240" w:lineRule="auto"/>
+        <w:ind w:left="425" w:right="0" w:hanging="283"/>
+        <w:jc w:val="left"/>
+      </w:pPr>
+      <w:r>
+        <w:rPr>
+          <w:rFonts w:ascii="TH Sarabun New" w:hAnsi="TH Sarabun New" w:eastAsia="TH Sarabun New"/>
+          <w:b w:val="0"/>
+          <w:sz w:val="32"/>
+        </w:rPr>
+        <w:t xml:space="preserve">4. </w:t>
+      </w:r>
+      <w:r>
+        <w:rPr>
+          <w:rFonts w:ascii="TH Sarabun New" w:hAnsi="TH Sarabun New" w:eastAsia="TH Sarabun New"/>
+          <w:b w:val="0"/>
+          <w:sz w:val="32"/>
+        </w:rPr>
+        <w:t>คลิกที่การ์ดสินค้าเพื่อดูรายละเอียดเพิ่มเติม</w:t>
+      </w:r>
+    </w:p>
+    <w:p>
+      <w:pPr>
+        <w:keepNext w:val="0"/>
+        <w:keepLines w:val="0"/>
+        <w:spacing w:before="0" w:after="0" w:line="240" w:lineRule="auto"/>
+        <w:ind w:left="0" w:right="0" w:firstLine="709"/>
+        <w:jc w:val="thaiDistribute"/>
+      </w:pPr>
+      <w:r>
+        <w:rPr>
+          <w:rFonts w:ascii="TH Sarabun New" w:hAnsi="TH Sarabun New" w:eastAsia="TH Sarabun New"/>
+          <w:b w:val="0"/>
+          <w:sz w:val="32"/>
+        </w:rPr>
+        <w:t>**การเพิ่มรายการลงตะกร้า**</w:t>
+      </w:r>
+    </w:p>
+    <w:p>
+      <w:pPr>
+        <w:keepNext w:val="0"/>
+        <w:keepLines w:val="0"/>
+        <w:spacing w:before="0" w:after="0" w:line="240" w:lineRule="auto"/>
+        <w:ind w:left="425" w:right="0" w:hanging="283"/>
+        <w:jc w:val="left"/>
+      </w:pPr>
+      <w:r>
+        <w:rPr>
+          <w:rFonts w:ascii="TH Sarabun New" w:hAnsi="TH Sarabun New" w:eastAsia="TH Sarabun New"/>
+          <w:b w:val="0"/>
+          <w:sz w:val="32"/>
+        </w:rPr>
+        <w:t xml:space="preserve">1. </w:t>
+      </w:r>
+      <w:r>
+        <w:rPr>
+          <w:rFonts w:ascii="TH Sarabun New" w:hAnsi="TH Sarabun New" w:eastAsia="TH Sarabun New"/>
+          <w:b w:val="0"/>
+          <w:sz w:val="32"/>
+        </w:rPr>
+        <w:t>ที่หน้าแคตตาล็อกหรือหน้ารายละเอียด กดปุ่มเพิ่มลงตะกร้า</w:t>
+      </w:r>
+    </w:p>
+    <w:p>
+      <w:pPr>
+        <w:keepNext w:val="0"/>
+        <w:keepLines w:val="0"/>
+        <w:spacing w:before="0" w:after="0" w:line="240" w:lineRule="auto"/>
+        <w:ind w:left="425" w:right="0" w:hanging="283"/>
+        <w:jc w:val="left"/>
+      </w:pPr>
+      <w:r>
+        <w:rPr>
+          <w:rFonts w:ascii="TH Sarabun New" w:hAnsi="TH Sarabun New" w:eastAsia="TH Sarabun New"/>
+          <w:b w:val="0"/>
+          <w:sz w:val="32"/>
+        </w:rPr>
+        <w:t xml:space="preserve">2. </w:t>
+      </w:r>
+      <w:r>
+        <w:rPr>
+          <w:rFonts w:ascii="TH Sarabun New" w:hAnsi="TH Sarabun New" w:eastAsia="TH Sarabun New"/>
+          <w:b w:val="0"/>
+          <w:sz w:val="32"/>
+        </w:rPr>
+        <w:t>ระบบจะอัปเดตจำนวนรายการบนปุ่มตะกร้า</w:t>
+      </w:r>
+    </w:p>
+    <w:p>
+      <w:pPr>
+        <w:keepNext w:val="0"/>
+        <w:keepLines w:val="0"/>
+        <w:spacing w:before="0" w:after="0" w:line="240" w:lineRule="auto"/>
+        <w:ind w:left="425" w:right="0" w:hanging="283"/>
+        <w:jc w:val="left"/>
+      </w:pPr>
+      <w:r>
+        <w:rPr>
+          <w:rFonts w:ascii="TH Sarabun New" w:hAnsi="TH Sarabun New" w:eastAsia="TH Sarabun New"/>
+          <w:b w:val="0"/>
+          <w:sz w:val="32"/>
+        </w:rPr>
+        <w:t xml:space="preserve">3. </w:t>
+      </w:r>
+      <w:r>
+        <w:rPr>
+          <w:rFonts w:ascii="TH Sarabun New" w:hAnsi="TH Sarabun New" w:eastAsia="TH Sarabun New"/>
+          <w:b w:val="0"/>
+          <w:sz w:val="32"/>
+        </w:rPr>
+        <w:t>กดปุ่มตะกร้าเพื่อตรวจสอบรายการทั้งหมด</w:t>
+      </w:r>
+    </w:p>
+    <w:p>
+      <w:pPr>
+        <w:keepNext w:val="0"/>
+        <w:keepLines w:val="0"/>
+        <w:spacing w:before="0" w:after="0" w:line="240" w:lineRule="auto"/>
+        <w:ind w:left="0" w:right="0" w:firstLine="709"/>
+        <w:jc w:val="thaiDistribute"/>
+      </w:pPr>
+      <w:r>
+        <w:rPr>
+          <w:rFonts w:ascii="TH Sarabun New" w:hAnsi="TH Sarabun New" w:eastAsia="TH Sarabun New"/>
+          <w:b w:val="0"/>
+          <w:sz w:val="32"/>
+        </w:rPr>
+        <w:t>**ขั้นตอนการจอง**</w:t>
+      </w:r>
+    </w:p>
+    <w:p>
+      <w:pPr>
+        <w:keepNext w:val="0"/>
+        <w:keepLines w:val="0"/>
+        <w:spacing w:before="0" w:after="0" w:line="240" w:lineRule="auto"/>
+        <w:ind w:left="425" w:right="0" w:hanging="283"/>
+        <w:jc w:val="left"/>
+      </w:pPr>
+      <w:r>
+        <w:rPr>
+          <w:rFonts w:ascii="TH Sarabun New" w:hAnsi="TH Sarabun New" w:eastAsia="TH Sarabun New"/>
+          <w:b w:val="0"/>
+          <w:sz w:val="32"/>
+        </w:rPr>
+        <w:t>ขั้นตอนที่ 1: ตรวจสอบรายการในตะกร้าและจำนวน</w:t>
+      </w:r>
+    </w:p>
+    <w:p>
+      <w:pPr>
+        <w:keepNext w:val="0"/>
+        <w:keepLines w:val="0"/>
+        <w:spacing w:before="0" w:after="0" w:line="240" w:lineRule="auto"/>
+        <w:ind w:left="425" w:right="0" w:hanging="283"/>
+        <w:jc w:val="left"/>
+      </w:pPr>
+      <w:r>
+        <w:rPr>
+          <w:rFonts w:ascii="TH Sarabun New" w:hAnsi="TH Sarabun New" w:eastAsia="TH Sarabun New"/>
+          <w:b w:val="0"/>
+          <w:sz w:val="32"/>
+        </w:rPr>
+        <w:t>ขั้นตอนที่ 2: เลือกวันเริ่มต้นและวันสิ้นสุด</w:t>
+      </w:r>
+    </w:p>
+    <w:p>
+      <w:pPr>
+        <w:keepNext w:val="0"/>
+        <w:keepLines w:val="0"/>
+        <w:spacing w:before="0" w:after="0" w:line="240" w:lineRule="auto"/>
+        <w:ind w:left="425" w:right="0" w:hanging="283"/>
+        <w:jc w:val="left"/>
+      </w:pPr>
+      <w:r>
+        <w:rPr>
+          <w:rFonts w:ascii="TH Sarabun New" w:hAnsi="TH Sarabun New" w:eastAsia="TH Sarabun New"/>
+          <w:b w:val="0"/>
+          <w:sz w:val="32"/>
+        </w:rPr>
+        <w:t>ขั้นตอนที่ 3: ตรวจสอบและยืนยันรายการ</w:t>
+      </w:r>
+    </w:p>
+    <w:p>
+      <w:pPr>
+        <w:keepNext w:val="0"/>
+        <w:keepLines w:val="0"/>
+        <w:spacing w:before="0" w:after="0" w:line="240" w:lineRule="auto"/>
+        <w:ind w:left="425" w:right="0" w:hanging="283"/>
+        <w:jc w:val="left"/>
+      </w:pPr>
+      <w:r>
+        <w:rPr>
+          <w:rFonts w:ascii="TH Sarabun New" w:hAnsi="TH Sarabun New" w:eastAsia="TH Sarabun New"/>
+          <w:b w:val="0"/>
+          <w:sz w:val="32"/>
+        </w:rPr>
+        <w:t>กรอกชื่อโครงการหรือหมายเหตุ</w:t>
+      </w:r>
+    </w:p>
+    <w:p>
+      <w:pPr>
+        <w:keepNext w:val="0"/>
+        <w:keepLines w:val="0"/>
+        <w:spacing w:before="0" w:after="0" w:line="240" w:lineRule="auto"/>
+        <w:ind w:left="425" w:right="0" w:hanging="283"/>
+        <w:jc w:val="left"/>
+      </w:pPr>
+      <w:r>
+        <w:rPr>
+          <w:rFonts w:ascii="TH Sarabun New" w:hAnsi="TH Sarabun New" w:eastAsia="TH Sarabun New"/>
+          <w:b w:val="0"/>
+          <w:sz w:val="32"/>
+        </w:rPr>
+        <w:t>กรอกข้อมูลติดต่อให้ครบถ้วน</w:t>
+      </w:r>
+    </w:p>
+    <w:p>
+      <w:pPr>
+        <w:keepNext w:val="0"/>
+        <w:keepLines w:val="0"/>
+        <w:spacing w:before="0" w:after="0" w:line="240" w:lineRule="auto"/>
+        <w:ind w:left="425" w:right="0" w:hanging="283"/>
+        <w:jc w:val="left"/>
+      </w:pPr>
+      <w:r>
+        <w:rPr>
+          <w:rFonts w:ascii="TH Sarabun New" w:hAnsi="TH Sarabun New" w:eastAsia="TH Sarabun New"/>
+          <w:b w:val="0"/>
+          <w:sz w:val="32"/>
+        </w:rPr>
+        <w:t>ใส่โค้ดส่วนลด (ถ้ามี)</w:t>
+      </w:r>
+    </w:p>
+    <w:p>
+      <w:pPr>
+        <w:keepNext w:val="0"/>
+        <w:keepLines w:val="0"/>
+        <w:spacing w:before="0" w:after="0" w:line="240" w:lineRule="auto"/>
+        <w:ind w:left="425" w:right="0" w:hanging="283"/>
+        <w:jc w:val="left"/>
+      </w:pPr>
+      <w:r>
+        <w:rPr>
+          <w:rFonts w:ascii="TH Sarabun New" w:hAnsi="TH Sarabun New" w:eastAsia="TH Sarabun New"/>
+          <w:b w:val="0"/>
+          <w:sz w:val="32"/>
+        </w:rPr>
+        <w:t>ตรวจสอบราคารวมและยืนยันการจอง</w:t>
+      </w:r>
+    </w:p>
+    <w:p>
+      <w:pPr>
+        <w:keepNext w:val="0"/>
+        <w:keepLines w:val="0"/>
+        <w:spacing w:before="0" w:after="0" w:line="240" w:lineRule="auto"/>
+        <w:ind w:left="0" w:right="0" w:firstLine="709"/>
+        <w:jc w:val="thaiDistribute"/>
+      </w:pPr>
+      <w:r>
+        <w:rPr>
+          <w:rFonts w:ascii="TH Sarabun New" w:hAnsi="TH Sarabun New" w:eastAsia="TH Sarabun New"/>
+          <w:b w:val="0"/>
+          <w:sz w:val="32"/>
+        </w:rPr>
+        <w:t>**การชำระเงินและแนบสลิป**</w:t>
+      </w:r>
+    </w:p>
+    <w:p>
+      <w:pPr>
+        <w:keepNext w:val="0"/>
+        <w:keepLines w:val="0"/>
+        <w:spacing w:before="0" w:after="0" w:line="240" w:lineRule="auto"/>
+        <w:ind w:left="425" w:right="0" w:hanging="283"/>
+        <w:jc w:val="left"/>
+      </w:pPr>
+      <w:r>
+        <w:rPr>
+          <w:rFonts w:ascii="TH Sarabun New" w:hAnsi="TH Sarabun New" w:eastAsia="TH Sarabun New"/>
+          <w:b w:val="0"/>
+          <w:sz w:val="32"/>
+        </w:rPr>
+        <w:t xml:space="preserve">1. </w:t>
+      </w:r>
+      <w:r>
+        <w:rPr>
+          <w:rFonts w:ascii="TH Sarabun New" w:hAnsi="TH Sarabun New" w:eastAsia="TH Sarabun New"/>
+          <w:b w:val="0"/>
+          <w:sz w:val="32"/>
+        </w:rPr>
+        <w:t>ไปที่เมนูรายการจองของฉัน</w:t>
+      </w:r>
+    </w:p>
+    <w:p>
+      <w:pPr>
+        <w:keepNext w:val="0"/>
+        <w:keepLines w:val="0"/>
+        <w:spacing w:before="0" w:after="0" w:line="240" w:lineRule="auto"/>
+        <w:ind w:left="425" w:right="0" w:hanging="283"/>
+        <w:jc w:val="left"/>
+      </w:pPr>
+      <w:r>
+        <w:rPr>
+          <w:rFonts w:ascii="TH Sarabun New" w:hAnsi="TH Sarabun New" w:eastAsia="TH Sarabun New"/>
+          <w:b w:val="0"/>
+          <w:sz w:val="32"/>
+        </w:rPr>
+        <w:t xml:space="preserve">2. </w:t>
+      </w:r>
+      <w:r>
+        <w:rPr>
+          <w:rFonts w:ascii="TH Sarabun New" w:hAnsi="TH Sarabun New" w:eastAsia="TH Sarabun New"/>
+          <w:b w:val="0"/>
+          <w:sz w:val="32"/>
+        </w:rPr>
+        <w:t>เปิดรายการที่ต้องการชำระเงิน</w:t>
+      </w:r>
+    </w:p>
+    <w:p>
+      <w:pPr>
+        <w:keepNext w:val="0"/>
+        <w:keepLines w:val="0"/>
+        <w:spacing w:before="0" w:after="0" w:line="240" w:lineRule="auto"/>
+        <w:ind w:left="425" w:right="0" w:hanging="283"/>
+        <w:jc w:val="left"/>
+      </w:pPr>
+      <w:r>
+        <w:rPr>
+          <w:rFonts w:ascii="TH Sarabun New" w:hAnsi="TH Sarabun New" w:eastAsia="TH Sarabun New"/>
+          <w:b w:val="0"/>
+          <w:sz w:val="32"/>
+        </w:rPr>
+        <w:t xml:space="preserve">3. </w:t>
+      </w:r>
+      <w:r>
+        <w:rPr>
+          <w:rFonts w:ascii="TH Sarabun New" w:hAnsi="TH Sarabun New" w:eastAsia="TH Sarabun New"/>
+          <w:b w:val="0"/>
+          <w:sz w:val="32"/>
+        </w:rPr>
+        <w:t>ตรวจสอบยอดมัดจำหรือยอดชำระ</w:t>
+      </w:r>
+    </w:p>
+    <w:p>
+      <w:pPr>
+        <w:keepNext w:val="0"/>
+        <w:keepLines w:val="0"/>
+        <w:spacing w:before="0" w:after="0" w:line="240" w:lineRule="auto"/>
+        <w:ind w:left="425" w:right="0" w:hanging="283"/>
+        <w:jc w:val="left"/>
+      </w:pPr>
+      <w:r>
+        <w:rPr>
+          <w:rFonts w:ascii="TH Sarabun New" w:hAnsi="TH Sarabun New" w:eastAsia="TH Sarabun New"/>
+          <w:b w:val="0"/>
+          <w:sz w:val="32"/>
+        </w:rPr>
+        <w:t xml:space="preserve">4. </w:t>
+      </w:r>
+      <w:r>
+        <w:rPr>
+          <w:rFonts w:ascii="TH Sarabun New" w:hAnsi="TH Sarabun New" w:eastAsia="TH Sarabun New"/>
+          <w:b w:val="0"/>
+          <w:sz w:val="32"/>
+        </w:rPr>
+        <w:t>โอนเงินตามช่องทางที่หน่วยงานกำหนด</w:t>
+      </w:r>
+    </w:p>
+    <w:p>
+      <w:pPr>
+        <w:keepNext w:val="0"/>
+        <w:keepLines w:val="0"/>
+        <w:spacing w:before="0" w:after="0" w:line="240" w:lineRule="auto"/>
+        <w:ind w:left="425" w:right="0" w:hanging="283"/>
+        <w:jc w:val="left"/>
+      </w:pPr>
+      <w:r>
+        <w:rPr>
+          <w:rFonts w:ascii="TH Sarabun New" w:hAnsi="TH Sarabun New" w:eastAsia="TH Sarabun New"/>
+          <w:b w:val="0"/>
+          <w:sz w:val="32"/>
+        </w:rPr>
+        <w:t xml:space="preserve">5. </w:t>
+      </w:r>
+      <w:r>
+        <w:rPr>
+          <w:rFonts w:ascii="TH Sarabun New" w:hAnsi="TH Sarabun New" w:eastAsia="TH Sarabun New"/>
+          <w:b w:val="0"/>
+          <w:sz w:val="32"/>
+        </w:rPr>
+        <w:t>กดปุ่มแนบหลักฐานการโอน</w:t>
+      </w:r>
+    </w:p>
+    <w:p>
+      <w:pPr>
+        <w:keepNext w:val="0"/>
+        <w:keepLines w:val="0"/>
+        <w:spacing w:before="0" w:after="0" w:line="240" w:lineRule="auto"/>
+        <w:ind w:left="425" w:right="0" w:hanging="283"/>
+        <w:jc w:val="left"/>
+      </w:pPr>
+      <w:r>
+        <w:rPr>
+          <w:rFonts w:ascii="TH Sarabun New" w:hAnsi="TH Sarabun New" w:eastAsia="TH Sarabun New"/>
+          <w:b w:val="0"/>
+          <w:sz w:val="32"/>
+        </w:rPr>
+        <w:t xml:space="preserve">6. </w:t>
+      </w:r>
+      <w:r>
+        <w:rPr>
+          <w:rFonts w:ascii="TH Sarabun New" w:hAnsi="TH Sarabun New" w:eastAsia="TH Sarabun New"/>
+          <w:b w:val="0"/>
+          <w:sz w:val="32"/>
+        </w:rPr>
+        <w:t>เลือกไฟล์ภาพสลิปและอัปโหลด</w:t>
+      </w:r>
+    </w:p>
+    <w:p>
+      <w:pPr>
+        <w:keepNext w:val="0"/>
+        <w:keepLines w:val="0"/>
+        <w:spacing w:before="0" w:after="0" w:line="240" w:lineRule="auto"/>
+        <w:ind w:left="425" w:right="0" w:hanging="283"/>
+        <w:jc w:val="left"/>
+      </w:pPr>
+      <w:r>
+        <w:rPr>
+          <w:rFonts w:ascii="TH Sarabun New" w:hAnsi="TH Sarabun New" w:eastAsia="TH Sarabun New"/>
+          <w:b w:val="0"/>
+          <w:sz w:val="32"/>
+        </w:rPr>
+        <w:t xml:space="preserve">7. </w:t>
+      </w:r>
+      <w:r>
+        <w:rPr>
+          <w:rFonts w:ascii="TH Sarabun New" w:hAnsi="TH Sarabun New" w:eastAsia="TH Sarabun New"/>
+          <w:b w:val="0"/>
+          <w:sz w:val="32"/>
+        </w:rPr>
+        <w:t>รอเจ้าหน้าที่ตรวจสอบ</w:t>
+      </w:r>
+    </w:p>
+    <w:p>
+      <w:pPr>
+        <w:keepNext w:val="0"/>
+        <w:keepLines w:val="0"/>
+        <w:spacing w:before="0" w:after="0" w:line="240" w:lineRule="auto"/>
+        <w:ind w:left="0" w:right="0" w:firstLine="709"/>
+        <w:jc w:val="thaiDistribute"/>
+      </w:pPr>
+      <w:r>
+        <w:rPr>
+          <w:rFonts w:ascii="TH Sarabun New" w:hAnsi="TH Sarabun New" w:eastAsia="TH Sarabun New"/>
+          <w:b w:val="0"/>
+          <w:sz w:val="32"/>
+        </w:rPr>
+        <w:t>**การติดตามสถานะการจอง**</w:t>
+      </w:r>
+    </w:p>
+    <w:p>
+      <w:pPr>
+        <w:keepNext w:val="0"/>
+        <w:keepLines w:val="0"/>
+        <w:spacing w:before="0" w:after="0" w:line="240" w:lineRule="auto"/>
+        <w:ind w:left="0" w:right="0" w:firstLine="709"/>
+        <w:jc w:val="thaiDistribute"/>
+      </w:pPr>
+      <w:r>
+        <w:rPr>
+          <w:rFonts w:ascii="TH Sarabun New" w:hAnsi="TH Sarabun New" w:eastAsia="TH Sarabun New"/>
+          <w:b w:val="0"/>
+          <w:sz w:val="32"/>
+        </w:rPr>
+        <w:t>สถานะหลักของรายการ:</w:t>
+      </w:r>
+    </w:p>
+    <w:p>
+      <w:pPr>
+        <w:keepNext w:val="0"/>
+        <w:keepLines w:val="0"/>
+        <w:spacing w:before="0" w:after="0" w:line="240" w:lineRule="auto"/>
+        <w:ind w:left="425" w:right="0" w:hanging="283"/>
+        <w:jc w:val="left"/>
+      </w:pPr>
+      <w:r>
+        <w:rPr>
+          <w:rFonts w:ascii="TH Sarabun New" w:hAnsi="TH Sarabun New" w:eastAsia="TH Sarabun New"/>
+          <w:b w:val="0"/>
+          <w:sz w:val="32"/>
+        </w:rPr>
+        <w:t>Draft: รายการถูกสร้างแล้วแต่ยังรอตรวจสอบ</w:t>
+      </w:r>
+    </w:p>
+    <w:p>
+      <w:pPr>
+        <w:keepNext w:val="0"/>
+        <w:keepLines w:val="0"/>
+        <w:spacing w:before="0" w:after="0" w:line="240" w:lineRule="auto"/>
+        <w:ind w:left="425" w:right="0" w:hanging="283"/>
+        <w:jc w:val="left"/>
+      </w:pPr>
+      <w:r>
+        <w:rPr>
+          <w:rFonts w:ascii="TH Sarabun New" w:hAnsi="TH Sarabun New" w:eastAsia="TH Sarabun New"/>
+          <w:b w:val="0"/>
+          <w:sz w:val="32"/>
+        </w:rPr>
+        <w:t>Pending: รอการชำระเงินหรือรอตรวจสอบหลักฐาน</w:t>
+      </w:r>
+    </w:p>
+    <w:p>
+      <w:pPr>
+        <w:keepNext w:val="0"/>
+        <w:keepLines w:val="0"/>
+        <w:spacing w:before="0" w:after="0" w:line="240" w:lineRule="auto"/>
+        <w:ind w:left="425" w:right="0" w:hanging="283"/>
+        <w:jc w:val="left"/>
+      </w:pPr>
+      <w:r>
+        <w:rPr>
+          <w:rFonts w:ascii="TH Sarabun New" w:hAnsi="TH Sarabun New" w:eastAsia="TH Sarabun New"/>
+          <w:b w:val="0"/>
+          <w:sz w:val="32"/>
+        </w:rPr>
+        <w:t>Approved: ได้รับการอนุมัติแล้ว</w:t>
+      </w:r>
+    </w:p>
+    <w:p>
+      <w:pPr>
+        <w:keepNext w:val="0"/>
+        <w:keepLines w:val="0"/>
+        <w:spacing w:before="0" w:after="0" w:line="240" w:lineRule="auto"/>
+        <w:ind w:left="425" w:right="0" w:hanging="283"/>
+        <w:jc w:val="left"/>
+      </w:pPr>
+      <w:r>
+        <w:rPr>
+          <w:rFonts w:ascii="TH Sarabun New" w:hAnsi="TH Sarabun New" w:eastAsia="TH Sarabun New"/>
+          <w:b w:val="0"/>
+          <w:sz w:val="32"/>
+        </w:rPr>
+        <w:t>Active: อยู่ระหว่างการใช้งานจริง</w:t>
+      </w:r>
+    </w:p>
+    <w:p>
+      <w:pPr>
+        <w:keepNext w:val="0"/>
+        <w:keepLines w:val="0"/>
+        <w:spacing w:before="0" w:after="0" w:line="240" w:lineRule="auto"/>
+        <w:ind w:left="425" w:right="0" w:hanging="283"/>
+        <w:jc w:val="left"/>
+      </w:pPr>
+      <w:r>
+        <w:rPr>
+          <w:rFonts w:ascii="TH Sarabun New" w:hAnsi="TH Sarabun New" w:eastAsia="TH Sarabun New"/>
+          <w:b w:val="0"/>
+          <w:sz w:val="32"/>
+        </w:rPr>
+        <w:t>Overdue: เกินกำหนดคืน</w:t>
+      </w:r>
+    </w:p>
+    <w:p>
+      <w:pPr>
+        <w:keepNext w:val="0"/>
+        <w:keepLines w:val="0"/>
+        <w:spacing w:before="0" w:after="0" w:line="240" w:lineRule="auto"/>
+        <w:ind w:left="425" w:right="0" w:hanging="283"/>
+        <w:jc w:val="left"/>
+      </w:pPr>
+      <w:r>
+        <w:rPr>
+          <w:rFonts w:ascii="TH Sarabun New" w:hAnsi="TH Sarabun New" w:eastAsia="TH Sarabun New"/>
+          <w:b w:val="0"/>
+          <w:sz w:val="32"/>
+        </w:rPr>
+        <w:t>Completed: เสร็จสมบูรณ์</w:t>
+      </w:r>
+    </w:p>
+    <w:p>
+      <w:pPr>
+        <w:keepNext w:val="0"/>
+        <w:keepLines w:val="0"/>
+        <w:spacing w:before="0" w:after="0" w:line="240" w:lineRule="auto"/>
+        <w:ind w:left="425" w:right="0" w:hanging="283"/>
+        <w:jc w:val="left"/>
+      </w:pPr>
+      <w:r>
+        <w:rPr>
+          <w:rFonts w:ascii="TH Sarabun New" w:hAnsi="TH Sarabun New" w:eastAsia="TH Sarabun New"/>
+          <w:b w:val="0"/>
+          <w:sz w:val="32"/>
+        </w:rPr>
+        <w:t>Cancelled: ถูกยกเลิก</w:t>
+      </w:r>
+    </w:p>
+    <w:p>
+      <w:pPr>
+        <w:keepNext w:val="0"/>
+        <w:keepLines w:val="0"/>
+        <w:spacing w:before="0" w:after="0" w:line="240" w:lineRule="auto"/>
+        <w:ind w:left="0" w:right="0" w:firstLine="709"/>
+        <w:jc w:val="thaiDistribute"/>
+      </w:pPr>
+      <w:r>
+        <w:rPr>
+          <w:rFonts w:ascii="TH Sarabun New" w:hAnsi="TH Sarabun New" w:eastAsia="TH Sarabun New"/>
+          <w:b w:val="0"/>
+          <w:sz w:val="32"/>
+        </w:rPr>
+        <w:t>**การยกเลิกรายการจอง**</w:t>
+      </w:r>
+    </w:p>
+    <w:p>
+      <w:pPr>
+        <w:keepNext w:val="0"/>
+        <w:keepLines w:val="0"/>
+        <w:spacing w:before="0" w:after="0" w:line="240" w:lineRule="auto"/>
+        <w:ind w:left="425" w:right="0" w:hanging="283"/>
+        <w:jc w:val="left"/>
+      </w:pPr>
+      <w:r>
+        <w:rPr>
+          <w:rFonts w:ascii="TH Sarabun New" w:hAnsi="TH Sarabun New" w:eastAsia="TH Sarabun New"/>
+          <w:b w:val="0"/>
+          <w:sz w:val="32"/>
+        </w:rPr>
+        <w:t xml:space="preserve">1. </w:t>
+      </w:r>
+      <w:r>
+        <w:rPr>
+          <w:rFonts w:ascii="TH Sarabun New" w:hAnsi="TH Sarabun New" w:eastAsia="TH Sarabun New"/>
+          <w:b w:val="0"/>
+          <w:sz w:val="32"/>
+        </w:rPr>
+        <w:t>เปิดรายการที่ต้องการยกเลิก</w:t>
+      </w:r>
+    </w:p>
+    <w:p>
+      <w:pPr>
+        <w:keepNext w:val="0"/>
+        <w:keepLines w:val="0"/>
+        <w:spacing w:before="0" w:after="0" w:line="240" w:lineRule="auto"/>
+        <w:ind w:left="425" w:right="0" w:hanging="283"/>
+        <w:jc w:val="left"/>
+      </w:pPr>
+      <w:r>
+        <w:rPr>
+          <w:rFonts w:ascii="TH Sarabun New" w:hAnsi="TH Sarabun New" w:eastAsia="TH Sarabun New"/>
+          <w:b w:val="0"/>
+          <w:sz w:val="32"/>
+        </w:rPr>
+        <w:t xml:space="preserve">2. </w:t>
+      </w:r>
+      <w:r>
+        <w:rPr>
+          <w:rFonts w:ascii="TH Sarabun New" w:hAnsi="TH Sarabun New" w:eastAsia="TH Sarabun New"/>
+          <w:b w:val="0"/>
+          <w:sz w:val="32"/>
+        </w:rPr>
+        <w:t>ตรวจสอบว่ารายการอยู่ในสถานะที่ระบบอนุญาตให้ยกเลิก</w:t>
+      </w:r>
+    </w:p>
+    <w:p>
+      <w:pPr>
+        <w:keepNext w:val="0"/>
+        <w:keepLines w:val="0"/>
+        <w:spacing w:before="0" w:after="0" w:line="240" w:lineRule="auto"/>
+        <w:ind w:left="425" w:right="0" w:hanging="283"/>
+        <w:jc w:val="left"/>
+      </w:pPr>
+      <w:r>
+        <w:rPr>
+          <w:rFonts w:ascii="TH Sarabun New" w:hAnsi="TH Sarabun New" w:eastAsia="TH Sarabun New"/>
+          <w:b w:val="0"/>
+          <w:sz w:val="32"/>
+        </w:rPr>
+        <w:t xml:space="preserve">3. </w:t>
+      </w:r>
+      <w:r>
+        <w:rPr>
+          <w:rFonts w:ascii="TH Sarabun New" w:hAnsi="TH Sarabun New" w:eastAsia="TH Sarabun New"/>
+          <w:b w:val="0"/>
+          <w:sz w:val="32"/>
+        </w:rPr>
+        <w:t>กดปุ่มยกเลิกรายการและยืนยันตามหน้าต่างแจ้งเตือน</w:t>
+      </w:r>
+    </w:p>
+    <w:p>
+      <w:pPr>
+        <w:keepNext w:val="0"/>
+        <w:keepLines w:val="0"/>
+        <w:spacing w:before="0" w:after="0" w:line="240" w:lineRule="auto"/>
+        <w:ind w:left="0" w:right="0" w:firstLine="709"/>
+        <w:jc w:val="thaiDistribute"/>
+      </w:pPr>
+      <w:r>
+        <w:rPr>
+          <w:rFonts w:ascii="TH Sarabun New" w:hAnsi="TH Sarabun New" w:eastAsia="TH Sarabun New"/>
+          <w:b w:val="0"/>
+          <w:sz w:val="32"/>
+        </w:rPr>
+        <w:t>**ปัญหาที่ลูกค้ามักพบ**</w:t>
+      </w:r>
+    </w:p>
+    <w:p>
+      <w:pPr>
+        <w:keepNext w:val="0"/>
+        <w:keepLines w:val="0"/>
+        <w:spacing w:before="0" w:after="0" w:line="240" w:lineRule="auto"/>
+        <w:ind w:left="425" w:right="0" w:hanging="283"/>
+        <w:jc w:val="left"/>
+      </w:pPr>
+      <w:r>
+        <w:rPr>
+          <w:rFonts w:ascii="TH Sarabun New" w:hAnsi="TH Sarabun New" w:eastAsia="TH Sarabun New"/>
+          <w:b w:val="0"/>
+          <w:sz w:val="32"/>
+        </w:rPr>
+        <w:t>เพิ่มสินค้าไม่ได้: อาจเป็นเพราะสินค้าหมด ไม่พร้อมใช้งาน หรือจำนวนเต็มตามสต็อก</w:t>
+      </w:r>
+    </w:p>
+    <w:p>
+      <w:pPr>
+        <w:keepNext w:val="0"/>
+        <w:keepLines w:val="0"/>
+        <w:spacing w:before="0" w:after="0" w:line="240" w:lineRule="auto"/>
+        <w:ind w:left="425" w:right="0" w:hanging="283"/>
+        <w:jc w:val="left"/>
+      </w:pPr>
+      <w:r>
+        <w:rPr>
+          <w:rFonts w:ascii="TH Sarabun New" w:hAnsi="TH Sarabun New" w:eastAsia="TH Sarabun New"/>
+          <w:b w:val="0"/>
+          <w:sz w:val="32"/>
+        </w:rPr>
+        <w:t>ยืนยันรายการไม่ได้: ตรวจสอบว่าข้อมูลครบถ้วน วันถูกต้อง และไม่มีรายการชนกัน</w:t>
+      </w:r>
+    </w:p>
+    <w:p>
+      <w:pPr>
+        <w:keepNext w:val="0"/>
+        <w:keepLines w:val="0"/>
+        <w:spacing w:before="0" w:after="0" w:line="240" w:lineRule="auto"/>
+        <w:ind w:left="425" w:right="0" w:hanging="283"/>
+        <w:jc w:val="left"/>
+      </w:pPr>
+      <w:r>
+        <w:rPr>
+          <w:rFonts w:ascii="TH Sarabun New" w:hAnsi="TH Sarabun New" w:eastAsia="TH Sarabun New"/>
+          <w:b w:val="0"/>
+          <w:sz w:val="32"/>
+        </w:rPr>
+        <w:t>อัปโหลดสลิปแล้วสถานะไม่เปลี่ยนทันที: สถานะจะเปลี่ยนหลังเจ้าหน้าที่ตรวจสอบ</w:t>
+      </w:r>
+    </w:p>
+    <w:p>
+      <w:pPr>
+        <w:keepNext/>
+        <w:keepLines w:val="0"/>
+        <w:spacing w:before="80" w:after="40" w:line="240" w:lineRule="auto"/>
+        <w:ind w:left="425" w:right="0" w:firstLine="0"/>
+        <w:jc w:val="left"/>
+      </w:pPr>
+      <w:r>
+        <w:rPr>
+          <w:rFonts w:ascii="TH Sarabun New" w:hAnsi="TH Sarabun New" w:eastAsia="TH Sarabun New"/>
+          <w:b/>
+          <w:sz w:val="32"/>
+        </w:rPr>
+        <w:t>ช.4 คู่มือสำหรับเจ้าหน้าที่</w:t>
+      </w:r>
+    </w:p>
+    <w:p>
+      <w:pPr>
+        <w:keepNext w:val="0"/>
+        <w:keepLines w:val="0"/>
+        <w:spacing w:before="0" w:after="0" w:line="240" w:lineRule="auto"/>
+        <w:ind w:left="0" w:right="0" w:firstLine="709"/>
+        <w:jc w:val="thaiDistribute"/>
+      </w:pPr>
+      <w:r>
+        <w:rPr>
+          <w:rFonts w:ascii="TH Sarabun New" w:hAnsi="TH Sarabun New" w:eastAsia="TH Sarabun New"/>
+          <w:b w:val="0"/>
+          <w:sz w:val="32"/>
+        </w:rPr>
+        <w:t>**การเข้าสู่หน้าปฏิบัติการ**</w:t>
+      </w:r>
+    </w:p>
+    <w:p>
+      <w:pPr>
+        <w:keepNext w:val="0"/>
+        <w:keepLines w:val="0"/>
+        <w:spacing w:before="0" w:after="0" w:line="240" w:lineRule="auto"/>
+        <w:ind w:left="425" w:right="0" w:hanging="283"/>
+        <w:jc w:val="left"/>
+      </w:pPr>
+      <w:r>
+        <w:rPr>
+          <w:rFonts w:ascii="TH Sarabun New" w:hAnsi="TH Sarabun New" w:eastAsia="TH Sarabun New"/>
+          <w:b w:val="0"/>
+          <w:sz w:val="32"/>
+        </w:rPr>
+        <w:t xml:space="preserve">1. </w:t>
+      </w:r>
+      <w:r>
+        <w:rPr>
+          <w:rFonts w:ascii="TH Sarabun New" w:hAnsi="TH Sarabun New" w:eastAsia="TH Sarabun New"/>
+          <w:b w:val="0"/>
+          <w:sz w:val="32"/>
+        </w:rPr>
+        <w:t>เข้าสู่ระบบด้วยบัญชีที่มีสิทธิ์ของเจ้าหน้าที่</w:t>
+      </w:r>
+    </w:p>
+    <w:p>
+      <w:pPr>
+        <w:keepNext w:val="0"/>
+        <w:keepLines w:val="0"/>
+        <w:spacing w:before="0" w:after="0" w:line="240" w:lineRule="auto"/>
+        <w:ind w:left="425" w:right="0" w:hanging="283"/>
+        <w:jc w:val="left"/>
+      </w:pPr>
+      <w:r>
+        <w:rPr>
+          <w:rFonts w:ascii="TH Sarabun New" w:hAnsi="TH Sarabun New" w:eastAsia="TH Sarabun New"/>
+          <w:b w:val="0"/>
+          <w:sz w:val="32"/>
+        </w:rPr>
+        <w:t xml:space="preserve">2. </w:t>
+      </w:r>
+      <w:r>
+        <w:rPr>
+          <w:rFonts w:ascii="TH Sarabun New" w:hAnsi="TH Sarabun New" w:eastAsia="TH Sarabun New"/>
+          <w:b w:val="0"/>
+          <w:sz w:val="32"/>
+        </w:rPr>
+        <w:t>เปิดเมนูหน้าปฏิบัติการของเจ้าหน้าที่</w:t>
+      </w:r>
+    </w:p>
+    <w:p>
+      <w:pPr>
+        <w:keepNext w:val="0"/>
+        <w:keepLines w:val="0"/>
+        <w:spacing w:before="0" w:after="0" w:line="240" w:lineRule="auto"/>
+        <w:ind w:left="425" w:right="0" w:hanging="283"/>
+        <w:jc w:val="left"/>
+      </w:pPr>
+      <w:r>
+        <w:rPr>
+          <w:rFonts w:ascii="TH Sarabun New" w:hAnsi="TH Sarabun New" w:eastAsia="TH Sarabun New"/>
+          <w:b w:val="0"/>
+          <w:sz w:val="32"/>
+        </w:rPr>
+        <w:t xml:space="preserve">3. </w:t>
+      </w:r>
+      <w:r>
+        <w:rPr>
+          <w:rFonts w:ascii="TH Sarabun New" w:hAnsi="TH Sarabun New" w:eastAsia="TH Sarabun New"/>
+          <w:b w:val="0"/>
+          <w:sz w:val="32"/>
+        </w:rPr>
+        <w:t>ใช้เมนูสรุปรายการจองหรือแดชบอร์ดเพื่อดูรายการล่าสุด</w:t>
+      </w:r>
+    </w:p>
+    <w:p>
+      <w:pPr>
+        <w:keepNext w:val="0"/>
+        <w:keepLines w:val="0"/>
+        <w:spacing w:before="0" w:after="0" w:line="240" w:lineRule="auto"/>
+        <w:ind w:left="425" w:right="0" w:hanging="283"/>
+        <w:jc w:val="left"/>
+      </w:pPr>
+      <w:r>
+        <w:rPr>
+          <w:rFonts w:ascii="TH Sarabun New" w:hAnsi="TH Sarabun New" w:eastAsia="TH Sarabun New"/>
+          <w:b w:val="0"/>
+          <w:sz w:val="32"/>
+        </w:rPr>
+        <w:t xml:space="preserve">4. </w:t>
+      </w:r>
+      <w:r>
+        <w:rPr>
+          <w:rFonts w:ascii="TH Sarabun New" w:hAnsi="TH Sarabun New" w:eastAsia="TH Sarabun New"/>
+          <w:b w:val="0"/>
+          <w:sz w:val="32"/>
+        </w:rPr>
+        <w:t>ตรวจสอบไอคอนแจ้งเตือนเพื่อดูงานที่เข้ามาใหม่</w:t>
+      </w:r>
+    </w:p>
+    <w:p>
+      <w:pPr>
+        <w:keepNext w:val="0"/>
+        <w:keepLines w:val="0"/>
+        <w:spacing w:before="0" w:after="0" w:line="240" w:lineRule="auto"/>
+        <w:ind w:left="0" w:right="0" w:firstLine="709"/>
+        <w:jc w:val="thaiDistribute"/>
+      </w:pPr>
+      <w:r>
+        <w:rPr>
+          <w:rFonts w:ascii="TH Sarabun New" w:hAnsi="TH Sarabun New" w:eastAsia="TH Sarabun New"/>
+          <w:b w:val="0"/>
+          <w:sz w:val="32"/>
+        </w:rPr>
+        <w:t>**การตรวจสอบรายการจอง**</w:t>
+      </w:r>
+    </w:p>
+    <w:p>
+      <w:pPr>
+        <w:keepNext w:val="0"/>
+        <w:keepLines w:val="0"/>
+        <w:spacing w:before="0" w:after="0" w:line="240" w:lineRule="auto"/>
+        <w:ind w:left="425" w:right="0" w:hanging="283"/>
+        <w:jc w:val="left"/>
+      </w:pPr>
+      <w:r>
+        <w:rPr>
+          <w:rFonts w:ascii="TH Sarabun New" w:hAnsi="TH Sarabun New" w:eastAsia="TH Sarabun New"/>
+          <w:b w:val="0"/>
+          <w:sz w:val="32"/>
+        </w:rPr>
+        <w:t xml:space="preserve">1. </w:t>
+      </w:r>
+      <w:r>
+        <w:rPr>
+          <w:rFonts w:ascii="TH Sarabun New" w:hAnsi="TH Sarabun New" w:eastAsia="TH Sarabun New"/>
+          <w:b w:val="0"/>
+          <w:sz w:val="32"/>
+        </w:rPr>
+        <w:t>เปิดรายการที่ต้องการตรวจสอบจากแดชบอร์ด</w:t>
+      </w:r>
+    </w:p>
+    <w:p>
+      <w:pPr>
+        <w:keepNext w:val="0"/>
+        <w:keepLines w:val="0"/>
+        <w:spacing w:before="0" w:after="0" w:line="240" w:lineRule="auto"/>
+        <w:ind w:left="425" w:right="0" w:hanging="283"/>
+        <w:jc w:val="left"/>
+      </w:pPr>
+      <w:r>
+        <w:rPr>
+          <w:rFonts w:ascii="TH Sarabun New" w:hAnsi="TH Sarabun New" w:eastAsia="TH Sarabun New"/>
+          <w:b w:val="0"/>
+          <w:sz w:val="32"/>
+        </w:rPr>
+        <w:t xml:space="preserve">2. </w:t>
+      </w:r>
+      <w:r>
+        <w:rPr>
+          <w:rFonts w:ascii="TH Sarabun New" w:hAnsi="TH Sarabun New" w:eastAsia="TH Sarabun New"/>
+          <w:b w:val="0"/>
+          <w:sz w:val="32"/>
+        </w:rPr>
+        <w:t>ตรวจสอบข้อมูลลูกค้า รายการทรัพยากร และช่วงวัน</w:t>
+      </w:r>
+    </w:p>
+    <w:p>
+      <w:pPr>
+        <w:keepNext w:val="0"/>
+        <w:keepLines w:val="0"/>
+        <w:spacing w:before="0" w:after="0" w:line="240" w:lineRule="auto"/>
+        <w:ind w:left="425" w:right="0" w:hanging="283"/>
+        <w:jc w:val="left"/>
+      </w:pPr>
+      <w:r>
+        <w:rPr>
+          <w:rFonts w:ascii="TH Sarabun New" w:hAnsi="TH Sarabun New" w:eastAsia="TH Sarabun New"/>
+          <w:b w:val="0"/>
+          <w:sz w:val="32"/>
+        </w:rPr>
+        <w:t xml:space="preserve">3. </w:t>
+      </w:r>
+      <w:r>
+        <w:rPr>
+          <w:rFonts w:ascii="TH Sarabun New" w:hAnsi="TH Sarabun New" w:eastAsia="TH Sarabun New"/>
+          <w:b w:val="0"/>
+          <w:sz w:val="32"/>
+        </w:rPr>
+        <w:t>ตรวจสอบยอดค่าใช้จ่ายและหมายเหตุประกอบ</w:t>
+      </w:r>
+    </w:p>
+    <w:p>
+      <w:pPr>
+        <w:keepNext w:val="0"/>
+        <w:keepLines w:val="0"/>
+        <w:spacing w:before="0" w:after="0" w:line="240" w:lineRule="auto"/>
+        <w:ind w:left="425" w:right="0" w:hanging="283"/>
+        <w:jc w:val="left"/>
+      </w:pPr>
+      <w:r>
+        <w:rPr>
+          <w:rFonts w:ascii="TH Sarabun New" w:hAnsi="TH Sarabun New" w:eastAsia="TH Sarabun New"/>
+          <w:b w:val="0"/>
+          <w:sz w:val="32"/>
+        </w:rPr>
+        <w:t xml:space="preserve">4. </w:t>
+      </w:r>
+      <w:r>
+        <w:rPr>
+          <w:rFonts w:ascii="TH Sarabun New" w:hAnsi="TH Sarabun New" w:eastAsia="TH Sarabun New"/>
+          <w:b w:val="0"/>
+          <w:sz w:val="32"/>
+        </w:rPr>
+        <w:t>ตรวจสอบว่ารายการอยู่ในสถานะที่สามารถดำเนินการต่อได้</w:t>
+      </w:r>
+    </w:p>
+    <w:p>
+      <w:pPr>
+        <w:keepNext w:val="0"/>
+        <w:keepLines w:val="0"/>
+        <w:spacing w:before="0" w:after="0" w:line="240" w:lineRule="auto"/>
+        <w:ind w:left="0" w:right="0" w:firstLine="709"/>
+        <w:jc w:val="thaiDistribute"/>
+      </w:pPr>
+      <w:r>
+        <w:rPr>
+          <w:rFonts w:ascii="TH Sarabun New" w:hAnsi="TH Sarabun New" w:eastAsia="TH Sarabun New"/>
+          <w:b w:val="0"/>
+          <w:sz w:val="32"/>
+        </w:rPr>
+        <w:t>**การเปลี่ยนสถานะรายการ**</w:t>
+      </w:r>
+    </w:p>
+    <w:p>
+      <w:pPr>
+        <w:keepNext w:val="0"/>
+        <w:keepLines w:val="0"/>
+        <w:spacing w:before="0" w:after="0" w:line="240" w:lineRule="auto"/>
+        <w:ind w:left="0" w:right="0" w:firstLine="709"/>
+        <w:jc w:val="thaiDistribute"/>
+      </w:pPr>
+      <w:r>
+        <w:rPr>
+          <w:rFonts w:ascii="TH Sarabun New" w:hAnsi="TH Sarabun New" w:eastAsia="TH Sarabun New"/>
+          <w:b w:val="0"/>
+          <w:sz w:val="32"/>
+        </w:rPr>
+        <w:t>ลำดับการทำงานมาตรฐาน:</w:t>
+      </w:r>
+    </w:p>
+    <w:p>
+      <w:pPr>
+        <w:keepNext w:val="0"/>
+        <w:keepLines w:val="0"/>
+        <w:spacing w:before="0" w:after="0" w:line="240" w:lineRule="auto"/>
+        <w:ind w:left="425" w:right="0" w:hanging="283"/>
+        <w:jc w:val="left"/>
+      </w:pPr>
+      <w:r>
+        <w:rPr>
+          <w:rFonts w:ascii="TH Sarabun New" w:hAnsi="TH Sarabun New" w:eastAsia="TH Sarabun New"/>
+          <w:b w:val="0"/>
+          <w:sz w:val="32"/>
+        </w:rPr>
+        <w:t xml:space="preserve">1. </w:t>
+      </w:r>
+      <w:r>
+        <w:rPr>
+          <w:rFonts w:ascii="TH Sarabun New" w:hAnsi="TH Sarabun New" w:eastAsia="TH Sarabun New"/>
+          <w:b w:val="0"/>
+          <w:sz w:val="32"/>
+        </w:rPr>
+        <w:t>ตรวจสอบรายการใหม่และยืนยันความถูกต้องข้อมูล</w:t>
+      </w:r>
+    </w:p>
+    <w:p>
+      <w:pPr>
+        <w:keepNext w:val="0"/>
+        <w:keepLines w:val="0"/>
+        <w:spacing w:before="0" w:after="0" w:line="240" w:lineRule="auto"/>
+        <w:ind w:left="425" w:right="0" w:hanging="283"/>
+        <w:jc w:val="left"/>
+      </w:pPr>
+      <w:r>
+        <w:rPr>
+          <w:rFonts w:ascii="TH Sarabun New" w:hAnsi="TH Sarabun New" w:eastAsia="TH Sarabun New"/>
+          <w:b w:val="0"/>
+          <w:sz w:val="32"/>
+        </w:rPr>
+        <w:t xml:space="preserve">2. </w:t>
+      </w:r>
+      <w:r>
+        <w:rPr>
+          <w:rFonts w:ascii="TH Sarabun New" w:hAnsi="TH Sarabun New" w:eastAsia="TH Sarabun New"/>
+          <w:b w:val="0"/>
+          <w:sz w:val="32"/>
+        </w:rPr>
+        <w:t>ส่งคำขอชำระเงินหรือรอการแนบหลักฐาน</w:t>
+      </w:r>
+    </w:p>
+    <w:p>
+      <w:pPr>
+        <w:keepNext w:val="0"/>
+        <w:keepLines w:val="0"/>
+        <w:spacing w:before="0" w:after="0" w:line="240" w:lineRule="auto"/>
+        <w:ind w:left="425" w:right="0" w:hanging="283"/>
+        <w:jc w:val="left"/>
+      </w:pPr>
+      <w:r>
+        <w:rPr>
+          <w:rFonts w:ascii="TH Sarabun New" w:hAnsi="TH Sarabun New" w:eastAsia="TH Sarabun New"/>
+          <w:b w:val="0"/>
+          <w:sz w:val="32"/>
+        </w:rPr>
+        <w:t xml:space="preserve">3. </w:t>
+      </w:r>
+      <w:r>
+        <w:rPr>
+          <w:rFonts w:ascii="TH Sarabun New" w:hAnsi="TH Sarabun New" w:eastAsia="TH Sarabun New"/>
+          <w:b w:val="0"/>
+          <w:sz w:val="32"/>
+        </w:rPr>
+        <w:t>ตรวจสอบสลิปที่ผู้ใช้ส่งเข้ามา</w:t>
+      </w:r>
+    </w:p>
+    <w:p>
+      <w:pPr>
+        <w:keepNext w:val="0"/>
+        <w:keepLines w:val="0"/>
+        <w:spacing w:before="0" w:after="0" w:line="240" w:lineRule="auto"/>
+        <w:ind w:left="425" w:right="0" w:hanging="283"/>
+        <w:jc w:val="left"/>
+      </w:pPr>
+      <w:r>
+        <w:rPr>
+          <w:rFonts w:ascii="TH Sarabun New" w:hAnsi="TH Sarabun New" w:eastAsia="TH Sarabun New"/>
+          <w:b w:val="0"/>
+          <w:sz w:val="32"/>
+        </w:rPr>
+        <w:t xml:space="preserve">4. </w:t>
+      </w:r>
+      <w:r>
+        <w:rPr>
+          <w:rFonts w:ascii="TH Sarabun New" w:hAnsi="TH Sarabun New" w:eastAsia="TH Sarabun New"/>
+          <w:b w:val="0"/>
+          <w:sz w:val="32"/>
+        </w:rPr>
+        <w:t>อนุมัติรายการเมื่อข้อมูลครบถ้วน</w:t>
+      </w:r>
+    </w:p>
+    <w:p>
+      <w:pPr>
+        <w:keepNext w:val="0"/>
+        <w:keepLines w:val="0"/>
+        <w:spacing w:before="0" w:after="0" w:line="240" w:lineRule="auto"/>
+        <w:ind w:left="425" w:right="0" w:hanging="283"/>
+        <w:jc w:val="left"/>
+      </w:pPr>
+      <w:r>
+        <w:rPr>
+          <w:rFonts w:ascii="TH Sarabun New" w:hAnsi="TH Sarabun New" w:eastAsia="TH Sarabun New"/>
+          <w:b w:val="0"/>
+          <w:sz w:val="32"/>
+        </w:rPr>
+        <w:t xml:space="preserve">5. </w:t>
+      </w:r>
+      <w:r>
+        <w:rPr>
+          <w:rFonts w:ascii="TH Sarabun New" w:hAnsi="TH Sarabun New" w:eastAsia="TH Sarabun New"/>
+          <w:b w:val="0"/>
+          <w:sz w:val="32"/>
+        </w:rPr>
+        <w:t>เปลี่ยนสถานะเป็นกำลังใช้งานเมื่อถึงวันรับ</w:t>
+      </w:r>
+    </w:p>
+    <w:p>
+      <w:pPr>
+        <w:keepNext w:val="0"/>
+        <w:keepLines w:val="0"/>
+        <w:spacing w:before="0" w:after="0" w:line="240" w:lineRule="auto"/>
+        <w:ind w:left="425" w:right="0" w:hanging="283"/>
+        <w:jc w:val="left"/>
+      </w:pPr>
+      <w:r>
+        <w:rPr>
+          <w:rFonts w:ascii="TH Sarabun New" w:hAnsi="TH Sarabun New" w:eastAsia="TH Sarabun New"/>
+          <w:b w:val="0"/>
+          <w:sz w:val="32"/>
+        </w:rPr>
+        <w:t xml:space="preserve">6. </w:t>
+      </w:r>
+      <w:r>
+        <w:rPr>
+          <w:rFonts w:ascii="TH Sarabun New" w:hAnsi="TH Sarabun New" w:eastAsia="TH Sarabun New"/>
+          <w:b w:val="0"/>
+          <w:sz w:val="32"/>
+        </w:rPr>
+        <w:t>ปิดงานเมื่อรายการเสร็จสมบูรณ์</w:t>
+      </w:r>
+    </w:p>
+    <w:p>
+      <w:pPr>
+        <w:keepNext w:val="0"/>
+        <w:keepLines w:val="0"/>
+        <w:spacing w:before="0" w:after="0" w:line="240" w:lineRule="auto"/>
+        <w:ind w:left="0" w:right="0" w:firstLine="709"/>
+        <w:jc w:val="thaiDistribute"/>
+      </w:pPr>
+      <w:r>
+        <w:rPr>
+          <w:rFonts w:ascii="TH Sarabun New" w:hAnsi="TH Sarabun New" w:eastAsia="TH Sarabun New"/>
+          <w:b w:val="0"/>
+          <w:sz w:val="32"/>
+        </w:rPr>
+        <w:t>**การดูเอกสารประกอบรายการ**</w:t>
+      </w:r>
+    </w:p>
+    <w:p>
+      <w:pPr>
+        <w:keepNext w:val="0"/>
+        <w:keepLines w:val="0"/>
+        <w:spacing w:before="0" w:after="0" w:line="240" w:lineRule="auto"/>
+        <w:ind w:left="425" w:right="0" w:hanging="283"/>
+        <w:jc w:val="left"/>
+      </w:pPr>
+      <w:r>
+        <w:rPr>
+          <w:rFonts w:ascii="TH Sarabun New" w:hAnsi="TH Sarabun New" w:eastAsia="TH Sarabun New"/>
+          <w:b w:val="0"/>
+          <w:sz w:val="32"/>
+        </w:rPr>
+        <w:t xml:space="preserve">1. </w:t>
+      </w:r>
+      <w:r>
+        <w:rPr>
+          <w:rFonts w:ascii="TH Sarabun New" w:hAnsi="TH Sarabun New" w:eastAsia="TH Sarabun New"/>
+          <w:b w:val="0"/>
+          <w:sz w:val="32"/>
+        </w:rPr>
+        <w:t>เปิดหน้ารายละเอียดรายการจอง</w:t>
+      </w:r>
+    </w:p>
+    <w:p>
+      <w:pPr>
+        <w:keepNext w:val="0"/>
+        <w:keepLines w:val="0"/>
+        <w:spacing w:before="0" w:after="0" w:line="240" w:lineRule="auto"/>
+        <w:ind w:left="425" w:right="0" w:hanging="283"/>
+        <w:jc w:val="left"/>
+      </w:pPr>
+      <w:r>
+        <w:rPr>
+          <w:rFonts w:ascii="TH Sarabun New" w:hAnsi="TH Sarabun New" w:eastAsia="TH Sarabun New"/>
+          <w:b w:val="0"/>
+          <w:sz w:val="32"/>
+        </w:rPr>
+        <w:t xml:space="preserve">2. </w:t>
+      </w:r>
+      <w:r>
+        <w:rPr>
+          <w:rFonts w:ascii="TH Sarabun New" w:hAnsi="TH Sarabun New" w:eastAsia="TH Sarabun New"/>
+          <w:b w:val="0"/>
+          <w:sz w:val="32"/>
+        </w:rPr>
+        <w:t>ใช้ปุ่มเอกสาร เช่น ใบจอง ใบเสนอราคา หรือรายการตรวจรับ</w:t>
+      </w:r>
+    </w:p>
+    <w:p>
+      <w:pPr>
+        <w:keepNext w:val="0"/>
+        <w:keepLines w:val="0"/>
+        <w:spacing w:before="0" w:after="0" w:line="240" w:lineRule="auto"/>
+        <w:ind w:left="425" w:right="0" w:hanging="283"/>
+        <w:jc w:val="left"/>
+      </w:pPr>
+      <w:r>
+        <w:rPr>
+          <w:rFonts w:ascii="TH Sarabun New" w:hAnsi="TH Sarabun New" w:eastAsia="TH Sarabun New"/>
+          <w:b w:val="0"/>
+          <w:sz w:val="32"/>
+        </w:rPr>
+        <w:t xml:space="preserve">3. </w:t>
+      </w:r>
+      <w:r>
+        <w:rPr>
+          <w:rFonts w:ascii="TH Sarabun New" w:hAnsi="TH Sarabun New" w:eastAsia="TH Sarabun New"/>
+          <w:b w:val="0"/>
+          <w:sz w:val="32"/>
+        </w:rPr>
+        <w:t>ตรวจสอบความถูกต้องก่อนส่งออกหรือพิมพ์</w:t>
+      </w:r>
+    </w:p>
+    <w:p>
+      <w:pPr>
+        <w:keepNext w:val="0"/>
+        <w:keepLines w:val="0"/>
+        <w:spacing w:before="0" w:after="0" w:line="240" w:lineRule="auto"/>
+        <w:ind w:left="0" w:right="0" w:firstLine="709"/>
+        <w:jc w:val="thaiDistribute"/>
+      </w:pPr>
+      <w:r>
+        <w:rPr>
+          <w:rFonts w:ascii="TH Sarabun New" w:hAnsi="TH Sarabun New" w:eastAsia="TH Sarabun New"/>
+          <w:b w:val="0"/>
+          <w:sz w:val="32"/>
+        </w:rPr>
+        <w:t>**การค้นหาประวัติอุปกรณ์**</w:t>
+      </w:r>
+    </w:p>
+    <w:p>
+      <w:pPr>
+        <w:keepNext w:val="0"/>
+        <w:keepLines w:val="0"/>
+        <w:spacing w:before="0" w:after="0" w:line="240" w:lineRule="auto"/>
+        <w:ind w:left="425" w:right="0" w:hanging="283"/>
+        <w:jc w:val="left"/>
+      </w:pPr>
+      <w:r>
+        <w:rPr>
+          <w:rFonts w:ascii="TH Sarabun New" w:hAnsi="TH Sarabun New" w:eastAsia="TH Sarabun New"/>
+          <w:b w:val="0"/>
+          <w:sz w:val="32"/>
+        </w:rPr>
+        <w:t xml:space="preserve">1. </w:t>
+      </w:r>
+      <w:r>
+        <w:rPr>
+          <w:rFonts w:ascii="TH Sarabun New" w:hAnsi="TH Sarabun New" w:eastAsia="TH Sarabun New"/>
+          <w:b w:val="0"/>
+          <w:sz w:val="32"/>
+        </w:rPr>
+        <w:t>เข้าเมนูประวัติอุปกรณ์</w:t>
+      </w:r>
+    </w:p>
+    <w:p>
+      <w:pPr>
+        <w:keepNext w:val="0"/>
+        <w:keepLines w:val="0"/>
+        <w:spacing w:before="0" w:after="0" w:line="240" w:lineRule="auto"/>
+        <w:ind w:left="425" w:right="0" w:hanging="283"/>
+        <w:jc w:val="left"/>
+      </w:pPr>
+      <w:r>
+        <w:rPr>
+          <w:rFonts w:ascii="TH Sarabun New" w:hAnsi="TH Sarabun New" w:eastAsia="TH Sarabun New"/>
+          <w:b w:val="0"/>
+          <w:sz w:val="32"/>
+        </w:rPr>
+        <w:t xml:space="preserve">2. </w:t>
+      </w:r>
+      <w:r>
+        <w:rPr>
+          <w:rFonts w:ascii="TH Sarabun New" w:hAnsi="TH Sarabun New" w:eastAsia="TH Sarabun New"/>
+          <w:b w:val="0"/>
+          <w:sz w:val="32"/>
+        </w:rPr>
+        <w:t>ค้นหาด้วยชื่อสินค้า รหัสทรัพย์สิน หรือ Serial Number</w:t>
+      </w:r>
+    </w:p>
+    <w:p>
+      <w:pPr>
+        <w:keepNext w:val="0"/>
+        <w:keepLines w:val="0"/>
+        <w:spacing w:before="0" w:after="0" w:line="240" w:lineRule="auto"/>
+        <w:ind w:left="425" w:right="0" w:hanging="283"/>
+        <w:jc w:val="left"/>
+      </w:pPr>
+      <w:r>
+        <w:rPr>
+          <w:rFonts w:ascii="TH Sarabun New" w:hAnsi="TH Sarabun New" w:eastAsia="TH Sarabun New"/>
+          <w:b w:val="0"/>
+          <w:sz w:val="32"/>
+        </w:rPr>
+        <w:t xml:space="preserve">3. </w:t>
+      </w:r>
+      <w:r>
+        <w:rPr>
+          <w:rFonts w:ascii="TH Sarabun New" w:hAnsi="TH Sarabun New" w:eastAsia="TH Sarabun New"/>
+          <w:b w:val="0"/>
+          <w:sz w:val="32"/>
+        </w:rPr>
+        <w:t>ตรวจสอบประวัติการยืมคืนและสถานะล่าสุด</w:t>
+      </w:r>
+    </w:p>
+    <w:p>
+      <w:pPr>
+        <w:keepNext w:val="0"/>
+        <w:keepLines w:val="0"/>
+        <w:spacing w:before="0" w:after="0" w:line="240" w:lineRule="auto"/>
+        <w:ind w:left="0" w:right="0" w:firstLine="709"/>
+        <w:jc w:val="thaiDistribute"/>
+      </w:pPr>
+      <w:r>
+        <w:rPr>
+          <w:rFonts w:ascii="TH Sarabun New" w:hAnsi="TH Sarabun New" w:eastAsia="TH Sarabun New"/>
+          <w:b w:val="0"/>
+          <w:sz w:val="32"/>
+        </w:rPr>
+        <w:t>**การใช้งานรายงาน**</w:t>
+      </w:r>
+    </w:p>
+    <w:p>
+      <w:pPr>
+        <w:keepNext w:val="0"/>
+        <w:keepLines w:val="0"/>
+        <w:spacing w:before="0" w:after="0" w:line="240" w:lineRule="auto"/>
+        <w:ind w:left="425" w:right="0" w:hanging="283"/>
+        <w:jc w:val="left"/>
+      </w:pPr>
+      <w:r>
+        <w:rPr>
+          <w:rFonts w:ascii="TH Sarabun New" w:hAnsi="TH Sarabun New" w:eastAsia="TH Sarabun New"/>
+          <w:b w:val="0"/>
+          <w:sz w:val="32"/>
+        </w:rPr>
+        <w:t xml:space="preserve">1. </w:t>
+      </w:r>
+      <w:r>
+        <w:rPr>
+          <w:rFonts w:ascii="TH Sarabun New" w:hAnsi="TH Sarabun New" w:eastAsia="TH Sarabun New"/>
+          <w:b w:val="0"/>
+          <w:sz w:val="32"/>
+        </w:rPr>
+        <w:t>เข้าเมนูรายงานของเจ้าหน้าที่</w:t>
+      </w:r>
+    </w:p>
+    <w:p>
+      <w:pPr>
+        <w:keepNext w:val="0"/>
+        <w:keepLines w:val="0"/>
+        <w:spacing w:before="0" w:after="0" w:line="240" w:lineRule="auto"/>
+        <w:ind w:left="425" w:right="0" w:hanging="283"/>
+        <w:jc w:val="left"/>
+      </w:pPr>
+      <w:r>
+        <w:rPr>
+          <w:rFonts w:ascii="TH Sarabun New" w:hAnsi="TH Sarabun New" w:eastAsia="TH Sarabun New"/>
+          <w:b w:val="0"/>
+          <w:sz w:val="32"/>
+        </w:rPr>
+        <w:t xml:space="preserve">2. </w:t>
+      </w:r>
+      <w:r>
+        <w:rPr>
+          <w:rFonts w:ascii="TH Sarabun New" w:hAnsi="TH Sarabun New" w:eastAsia="TH Sarabun New"/>
+          <w:b w:val="0"/>
+          <w:sz w:val="32"/>
+        </w:rPr>
+        <w:t>เลือกช่วงเวลาหรือเงื่อนไขที่ต้องการ</w:t>
+      </w:r>
+    </w:p>
+    <w:p>
+      <w:pPr>
+        <w:keepNext w:val="0"/>
+        <w:keepLines w:val="0"/>
+        <w:spacing w:before="0" w:after="0" w:line="240" w:lineRule="auto"/>
+        <w:ind w:left="425" w:right="0" w:hanging="283"/>
+        <w:jc w:val="left"/>
+      </w:pPr>
+      <w:r>
+        <w:rPr>
+          <w:rFonts w:ascii="TH Sarabun New" w:hAnsi="TH Sarabun New" w:eastAsia="TH Sarabun New"/>
+          <w:b w:val="0"/>
+          <w:sz w:val="32"/>
+        </w:rPr>
+        <w:t xml:space="preserve">3. </w:t>
+      </w:r>
+      <w:r>
+        <w:rPr>
+          <w:rFonts w:ascii="TH Sarabun New" w:hAnsi="TH Sarabun New" w:eastAsia="TH Sarabun New"/>
+          <w:b w:val="0"/>
+          <w:sz w:val="32"/>
+        </w:rPr>
+        <w:t>ตรวจสอบผลสรุปบนหน้าจอ</w:t>
+      </w:r>
+    </w:p>
+    <w:p>
+      <w:pPr>
+        <w:keepNext w:val="0"/>
+        <w:keepLines w:val="0"/>
+        <w:spacing w:before="0" w:after="0" w:line="240" w:lineRule="auto"/>
+        <w:ind w:left="425" w:right="0" w:hanging="283"/>
+        <w:jc w:val="left"/>
+      </w:pPr>
+      <w:r>
+        <w:rPr>
+          <w:rFonts w:ascii="TH Sarabun New" w:hAnsi="TH Sarabun New" w:eastAsia="TH Sarabun New"/>
+          <w:b w:val="0"/>
+          <w:sz w:val="32"/>
+        </w:rPr>
+        <w:t xml:space="preserve">4. </w:t>
+      </w:r>
+      <w:r>
+        <w:rPr>
+          <w:rFonts w:ascii="TH Sarabun New" w:hAnsi="TH Sarabun New" w:eastAsia="TH Sarabun New"/>
+          <w:b w:val="0"/>
+          <w:sz w:val="32"/>
+        </w:rPr>
+        <w:t>ส่งออกข้อมูลเป็นไฟล์ (ถ้าต้องการ)</w:t>
+      </w:r>
+    </w:p>
+    <w:p>
+      <w:pPr>
+        <w:keepNext w:val="0"/>
+        <w:keepLines w:val="0"/>
+        <w:spacing w:before="0" w:after="0" w:line="240" w:lineRule="auto"/>
+        <w:ind w:left="0" w:right="0" w:firstLine="709"/>
+        <w:jc w:val="thaiDistribute"/>
+      </w:pPr>
+      <w:r>
+        <w:rPr>
+          <w:rFonts w:ascii="TH Sarabun New" w:hAnsi="TH Sarabun New" w:eastAsia="TH Sarabun New"/>
+          <w:b w:val="0"/>
+          <w:sz w:val="32"/>
+        </w:rPr>
+        <w:t>**การจัดการปัญหาเบื้องต้น**</w:t>
+      </w:r>
+    </w:p>
+    <w:p>
+      <w:pPr>
+        <w:keepNext w:val="0"/>
+        <w:keepLines w:val="0"/>
+        <w:spacing w:before="0" w:after="0" w:line="240" w:lineRule="auto"/>
+        <w:ind w:left="425" w:right="0" w:hanging="283"/>
+        <w:jc w:val="left"/>
+      </w:pPr>
+      <w:r>
+        <w:rPr>
+          <w:rFonts w:ascii="TH Sarabun New" w:hAnsi="TH Sarabun New" w:eastAsia="TH Sarabun New"/>
+          <w:b w:val="0"/>
+          <w:sz w:val="32"/>
+        </w:rPr>
+        <w:t>รายการแสดงข้อมูลไม่ครบ: รีเฟรชหน้าและตรวจสอบข้อมูลต้นทาง</w:t>
+      </w:r>
+    </w:p>
+    <w:p>
+      <w:pPr>
+        <w:keepNext w:val="0"/>
+        <w:keepLines w:val="0"/>
+        <w:spacing w:before="0" w:after="0" w:line="240" w:lineRule="auto"/>
+        <w:ind w:left="425" w:right="0" w:hanging="283"/>
+        <w:jc w:val="left"/>
+      </w:pPr>
+      <w:r>
+        <w:rPr>
+          <w:rFonts w:ascii="TH Sarabun New" w:hAnsi="TH Sarabun New" w:eastAsia="TH Sarabun New"/>
+          <w:b w:val="0"/>
+          <w:sz w:val="32"/>
+        </w:rPr>
+        <w:t>ระบบไม่อนุญาตให้เปลี่ยนสถานะ: ตรวจสอบสิทธิ์และสถานะปัจจุบันของรายการ</w:t>
+      </w:r>
+    </w:p>
+    <w:p>
+      <w:pPr>
+        <w:keepNext w:val="0"/>
+        <w:keepLines w:val="0"/>
+        <w:spacing w:before="0" w:after="0" w:line="240" w:lineRule="auto"/>
+        <w:ind w:left="425" w:right="0" w:hanging="283"/>
+        <w:jc w:val="left"/>
+      </w:pPr>
+      <w:r>
+        <w:rPr>
+          <w:rFonts w:ascii="TH Sarabun New" w:hAnsi="TH Sarabun New" w:eastAsia="TH Sarabun New"/>
+          <w:b w:val="0"/>
+          <w:sz w:val="32"/>
+        </w:rPr>
+        <w:t>เอกสาร PDF สร้างไม่สำเร็จ: ตรวจสอบข้อมูลรายการและลองใหม่</w:t>
+      </w:r>
+    </w:p>
+    <w:p>
+      <w:pPr>
+        <w:keepNext w:val="0"/>
+        <w:keepLines w:val="0"/>
+        <w:spacing w:before="0" w:after="0" w:line="240" w:lineRule="auto"/>
+        <w:ind w:left="425" w:right="0" w:hanging="283"/>
+        <w:jc w:val="left"/>
+      </w:pPr>
+      <w:r>
+        <w:rPr>
+          <w:rFonts w:ascii="TH Sarabun New" w:hAnsi="TH Sarabun New" w:eastAsia="TH Sarabun New"/>
+          <w:b w:val="0"/>
+          <w:sz w:val="32"/>
+        </w:rPr>
+        <w:t>ผู้ใช้ไม่สามารถอัปโหลดสลิปได้: ตรวจสอบขนาดและรูปแบบไฟล์</w:t>
+      </w:r>
+    </w:p>
+    <w:p>
+      <w:pPr>
+        <w:keepNext/>
+        <w:keepLines w:val="0"/>
+        <w:spacing w:before="80" w:after="40" w:line="240" w:lineRule="auto"/>
+        <w:ind w:left="425" w:right="0" w:firstLine="0"/>
+        <w:jc w:val="left"/>
+      </w:pPr>
+      <w:r>
+        <w:rPr>
+          <w:rFonts w:ascii="TH Sarabun New" w:hAnsi="TH Sarabun New" w:eastAsia="TH Sarabun New"/>
+          <w:b/>
+          <w:sz w:val="32"/>
+        </w:rPr>
+        <w:t>ช.5 คู่มือสำหรับผู้ดูแลระบบ</w:t>
+      </w:r>
+    </w:p>
+    <w:p>
+      <w:pPr>
+        <w:keepNext w:val="0"/>
+        <w:keepLines w:val="0"/>
+        <w:spacing w:before="0" w:after="0" w:line="240" w:lineRule="auto"/>
+        <w:ind w:left="0" w:right="0" w:firstLine="709"/>
+        <w:jc w:val="thaiDistribute"/>
+      </w:pPr>
+      <w:r>
+        <w:rPr>
+          <w:rFonts w:ascii="TH Sarabun New" w:hAnsi="TH Sarabun New" w:eastAsia="TH Sarabun New"/>
+          <w:b w:val="0"/>
+          <w:sz w:val="32"/>
+        </w:rPr>
+        <w:t>**การตรวจระบบก่อนอัปเดต**</w:t>
+      </w:r>
+    </w:p>
+    <w:p>
+      <w:pPr>
+        <w:keepNext w:val="0"/>
+        <w:keepLines w:val="0"/>
+        <w:spacing w:before="0" w:after="0" w:line="240" w:lineRule="auto"/>
+        <w:ind w:left="0" w:right="0" w:firstLine="709"/>
+        <w:jc w:val="thaiDistribute"/>
+      </w:pPr>
+      <w:r>
+        <w:rPr>
+          <w:rFonts w:ascii="TH Sarabun New" w:hAnsi="TH Sarabun New" w:eastAsia="TH Sarabun New"/>
+          <w:b w:val="0"/>
+          <w:sz w:val="32"/>
+        </w:rPr>
+        <w:t>ก่อนนำระบบขึ้นใช้งานจริงหรืออัปเดต ควรตรวจสอบ:</w:t>
+      </w:r>
+    </w:p>
+    <w:p>
+      <w:pPr>
+        <w:keepNext w:val="0"/>
+        <w:keepLines w:val="0"/>
+        <w:spacing w:before="0" w:after="0" w:line="240" w:lineRule="auto"/>
+        <w:ind w:left="425" w:right="0" w:hanging="283"/>
+        <w:jc w:val="left"/>
+      </w:pPr>
+      <w:r>
+        <w:rPr>
+          <w:rFonts w:ascii="TH Sarabun New" w:hAnsi="TH Sarabun New" w:eastAsia="TH Sarabun New"/>
+          <w:b w:val="0"/>
+          <w:sz w:val="32"/>
+        </w:rPr>
+        <w:t xml:space="preserve">1. </w:t>
+      </w:r>
+      <w:r>
+        <w:rPr>
+          <w:rFonts w:ascii="TH Sarabun New" w:hAnsi="TH Sarabun New" w:eastAsia="TH Sarabun New"/>
+          <w:b w:val="0"/>
+          <w:sz w:val="32"/>
+        </w:rPr>
+        <w:t>ตรวจสาขาโค้ดและจุดปรับปรุงล่าสุด</w:t>
+      </w:r>
+    </w:p>
+    <w:p>
+      <w:pPr>
+        <w:keepNext w:val="0"/>
+        <w:keepLines w:val="0"/>
+        <w:spacing w:before="0" w:after="0" w:line="240" w:lineRule="auto"/>
+        <w:ind w:left="425" w:right="0" w:hanging="283"/>
+        <w:jc w:val="left"/>
+      </w:pPr>
+      <w:r>
+        <w:rPr>
+          <w:rFonts w:ascii="TH Sarabun New" w:hAnsi="TH Sarabun New" w:eastAsia="TH Sarabun New"/>
+          <w:b w:val="0"/>
+          <w:sz w:val="32"/>
+        </w:rPr>
+        <w:t xml:space="preserve">2. </w:t>
+      </w:r>
+      <w:r>
+        <w:rPr>
+          <w:rFonts w:ascii="TH Sarabun New" w:hAnsi="TH Sarabun New" w:eastAsia="TH Sarabun New"/>
+          <w:b w:val="0"/>
+          <w:sz w:val="32"/>
+        </w:rPr>
+        <w:t>ตรวจสอบผล `git status`</w:t>
+      </w:r>
+    </w:p>
+    <w:p>
+      <w:pPr>
+        <w:keepNext w:val="0"/>
+        <w:keepLines w:val="0"/>
+        <w:spacing w:before="0" w:after="0" w:line="240" w:lineRule="auto"/>
+        <w:ind w:left="425" w:right="0" w:hanging="283"/>
+        <w:jc w:val="left"/>
+      </w:pPr>
+      <w:r>
+        <w:rPr>
+          <w:rFonts w:ascii="TH Sarabun New" w:hAnsi="TH Sarabun New" w:eastAsia="TH Sarabun New"/>
+          <w:b w:val="0"/>
+          <w:sz w:val="32"/>
+        </w:rPr>
+        <w:t xml:space="preserve">3. </w:t>
+      </w:r>
+      <w:r>
+        <w:rPr>
+          <w:rFonts w:ascii="TH Sarabun New" w:hAnsi="TH Sarabun New" w:eastAsia="TH Sarabun New"/>
+          <w:b w:val="0"/>
+          <w:sz w:val="32"/>
+        </w:rPr>
+        <w:t>รันคำสั่งตรวจระบบ `python3 manage.py check`</w:t>
+      </w:r>
+    </w:p>
+    <w:p>
+      <w:pPr>
+        <w:keepNext w:val="0"/>
+        <w:keepLines w:val="0"/>
+        <w:spacing w:before="0" w:after="0" w:line="240" w:lineRule="auto"/>
+        <w:ind w:left="425" w:right="0" w:hanging="283"/>
+        <w:jc w:val="left"/>
+      </w:pPr>
+      <w:r>
+        <w:rPr>
+          <w:rFonts w:ascii="TH Sarabun New" w:hAnsi="TH Sarabun New" w:eastAsia="TH Sarabun New"/>
+          <w:b w:val="0"/>
+          <w:sz w:val="32"/>
+        </w:rPr>
+        <w:t xml:space="preserve">4. </w:t>
+      </w:r>
+      <w:r>
+        <w:rPr>
+          <w:rFonts w:ascii="TH Sarabun New" w:hAnsi="TH Sarabun New" w:eastAsia="TH Sarabun New"/>
+          <w:b w:val="0"/>
+          <w:sz w:val="32"/>
+        </w:rPr>
+        <w:t>รันชุดทดสอบที่เกี่ยวข้อง</w:t>
+      </w:r>
+    </w:p>
+    <w:p>
+      <w:pPr>
+        <w:keepNext w:val="0"/>
+        <w:keepLines w:val="0"/>
+        <w:spacing w:before="0" w:after="0" w:line="240" w:lineRule="auto"/>
+        <w:ind w:left="0" w:right="0" w:firstLine="709"/>
+        <w:jc w:val="thaiDistribute"/>
+      </w:pPr>
+      <w:r>
+        <w:rPr>
+          <w:rFonts w:ascii="TH Sarabun New" w:hAnsi="TH Sarabun New" w:eastAsia="TH Sarabun New"/>
+          <w:b w:val="0"/>
+          <w:sz w:val="32"/>
+        </w:rPr>
+        <w:t>**การสำรองข้อมูล**</w:t>
+      </w:r>
+    </w:p>
+    <w:p>
+      <w:pPr>
+        <w:keepNext w:val="0"/>
+        <w:keepLines w:val="0"/>
+        <w:spacing w:before="0" w:after="0" w:line="240" w:lineRule="auto"/>
+        <w:ind w:left="0" w:right="0" w:firstLine="709"/>
+        <w:jc w:val="thaiDistribute"/>
+      </w:pPr>
+      <w:r>
+        <w:rPr>
+          <w:rFonts w:ascii="TH Sarabun New" w:hAnsi="TH Sarabun New" w:eastAsia="TH Sarabun New"/>
+          <w:b w:val="0"/>
+          <w:sz w:val="32"/>
+        </w:rPr>
+        <w:t>ห้อม deploy ทุกครั้ง ควรสำรองข้อมูลก่อน:</w:t>
+      </w:r>
+    </w:p>
+    <w:p>
+      <w:pPr>
+        <w:keepNext w:val="0"/>
+        <w:keepLines w:val="0"/>
+        <w:spacing w:before="0" w:after="0" w:line="240" w:lineRule="auto"/>
+        <w:ind w:left="0" w:right="0" w:firstLine="0"/>
+        <w:jc w:val="left"/>
+      </w:pPr>
+      <w:r>
+        <w:rPr>
+          <w:rFonts w:ascii="Courier New" w:hAnsi="Courier New" w:eastAsia="Courier New"/>
+          <w:b w:val="0"/>
+          <w:sz w:val="32"/>
+        </w:rPr>
+        <w:t>./scripts/db_backup.sh</w:t>
+      </w:r>
+    </w:p>
+    <w:p>
+      <w:pPr>
+        <w:keepNext w:val="0"/>
+        <w:keepLines w:val="0"/>
+        <w:spacing w:before="0" w:after="0" w:line="240" w:lineRule="auto"/>
+        <w:ind w:left="0" w:right="0" w:firstLine="709"/>
+        <w:jc w:val="thaiDistribute"/>
+      </w:pPr>
+      <w:r>
+        <w:rPr>
+          <w:rFonts w:ascii="TH Sarabun New" w:hAnsi="TH Sarabun New" w:eastAsia="TH Sarabun New"/>
+          <w:b w:val="0"/>
+          <w:sz w:val="32"/>
+        </w:rPr>
+        <w:t>ตรวจสอบ:</w:t>
+      </w:r>
+    </w:p>
+    <w:p>
+      <w:pPr>
+        <w:keepNext w:val="0"/>
+        <w:keepLines w:val="0"/>
+        <w:spacing w:before="0" w:after="0" w:line="240" w:lineRule="auto"/>
+        <w:ind w:left="425" w:right="0" w:hanging="283"/>
+        <w:jc w:val="left"/>
+      </w:pPr>
+      <w:r>
+        <w:rPr>
+          <w:rFonts w:ascii="TH Sarabun New" w:hAnsi="TH Sarabun New" w:eastAsia="TH Sarabun New"/>
+          <w:b w:val="0"/>
+          <w:sz w:val="32"/>
+        </w:rPr>
+        <w:t>พื้นที่เก็บข้อมูลเพียงพอ</w:t>
+      </w:r>
+    </w:p>
+    <w:p>
+      <w:pPr>
+        <w:keepNext w:val="0"/>
+        <w:keepLines w:val="0"/>
+        <w:spacing w:before="0" w:after="0" w:line="240" w:lineRule="auto"/>
+        <w:ind w:left="425" w:right="0" w:hanging="283"/>
+        <w:jc w:val="left"/>
+      </w:pPr>
+      <w:r>
+        <w:rPr>
+          <w:rFonts w:ascii="TH Sarabun New" w:hAnsi="TH Sarabun New" w:eastAsia="TH Sarabun New"/>
+          <w:b w:val="0"/>
+          <w:sz w:val="32"/>
+        </w:rPr>
+        <w:t>ปลายทางของไฟล์สำรองชัดเจน</w:t>
+      </w:r>
+    </w:p>
+    <w:p>
+      <w:pPr>
+        <w:keepNext w:val="0"/>
+        <w:keepLines w:val="0"/>
+        <w:spacing w:before="0" w:after="0" w:line="240" w:lineRule="auto"/>
+        <w:ind w:left="425" w:right="0" w:hanging="283"/>
+        <w:jc w:val="left"/>
+      </w:pPr>
+      <w:r>
+        <w:rPr>
+          <w:rFonts w:ascii="TH Sarabun New" w:hAnsi="TH Sarabun New" w:eastAsia="TH Sarabun New"/>
+          <w:b w:val="0"/>
+          <w:sz w:val="32"/>
+        </w:rPr>
+        <w:t>ทดสอบการกู้คืนแบบจำลอง</w:t>
+      </w:r>
+    </w:p>
+    <w:p>
+      <w:pPr>
+        <w:keepNext w:val="0"/>
+        <w:keepLines w:val="0"/>
+        <w:spacing w:before="0" w:after="0" w:line="240" w:lineRule="auto"/>
+        <w:ind w:left="0" w:right="0" w:firstLine="709"/>
+        <w:jc w:val="thaiDistribute"/>
+      </w:pPr>
+      <w:r>
+        <w:rPr>
+          <w:rFonts w:ascii="TH Sarabun New" w:hAnsi="TH Sarabun New" w:eastAsia="TH Sarabun New"/>
+          <w:b w:val="0"/>
+          <w:sz w:val="32"/>
+        </w:rPr>
+        <w:t>**การนำระบบขึ้นใช้งานจริง**</w:t>
+      </w:r>
+    </w:p>
+    <w:p>
+      <w:pPr>
+        <w:keepNext w:val="0"/>
+        <w:keepLines w:val="0"/>
+        <w:spacing w:before="0" w:after="0" w:line="240" w:lineRule="auto"/>
+        <w:ind w:left="0" w:right="0" w:firstLine="709"/>
+        <w:jc w:val="thaiDistribute"/>
+      </w:pPr>
+      <w:r>
+        <w:rPr>
+          <w:rFonts w:ascii="TH Sarabun New" w:hAnsi="TH Sarabun New" w:eastAsia="TH Sarabun New"/>
+          <w:b w:val="0"/>
+          <w:sz w:val="32"/>
+        </w:rPr>
+        <w:t>ขั้นตอนมาตรฐาน:</w:t>
+      </w:r>
+    </w:p>
+    <w:p>
+      <w:pPr>
+        <w:keepNext w:val="0"/>
+        <w:keepLines w:val="0"/>
+        <w:spacing w:before="0" w:after="0" w:line="240" w:lineRule="auto"/>
+        <w:ind w:left="425" w:right="0" w:hanging="283"/>
+        <w:jc w:val="left"/>
+      </w:pPr>
+      <w:r>
+        <w:rPr>
+          <w:rFonts w:ascii="TH Sarabun New" w:hAnsi="TH Sarabun New" w:eastAsia="TH Sarabun New"/>
+          <w:b w:val="0"/>
+          <w:sz w:val="32"/>
+        </w:rPr>
+        <w:t xml:space="preserve">1. </w:t>
+      </w:r>
+      <w:r>
+        <w:rPr>
+          <w:rFonts w:ascii="TH Sarabun New" w:hAnsi="TH Sarabun New" w:eastAsia="TH Sarabun New"/>
+          <w:b w:val="0"/>
+          <w:sz w:val="32"/>
+        </w:rPr>
+        <w:t>push โค้ดขึ้นสาขาที่ใช้งานจริง</w:t>
+      </w:r>
+    </w:p>
+    <w:p>
+      <w:pPr>
+        <w:keepNext w:val="0"/>
+        <w:keepLines w:val="0"/>
+        <w:spacing w:before="0" w:after="0" w:line="240" w:lineRule="auto"/>
+        <w:ind w:left="425" w:right="0" w:hanging="283"/>
+        <w:jc w:val="left"/>
+      </w:pPr>
+      <w:r>
+        <w:rPr>
+          <w:rFonts w:ascii="TH Sarabun New" w:hAnsi="TH Sarabun New" w:eastAsia="TH Sarabun New"/>
+          <w:b w:val="0"/>
+          <w:sz w:val="32"/>
+        </w:rPr>
+        <w:t xml:space="preserve">2. </w:t>
+      </w:r>
+      <w:r>
+        <w:rPr>
+          <w:rFonts w:ascii="TH Sarabun New" w:hAnsi="TH Sarabun New" w:eastAsia="TH Sarabun New"/>
+          <w:b w:val="0"/>
+          <w:sz w:val="32"/>
+        </w:rPr>
+        <w:t>ดึงโค้ดบนเครื่องแม่ข่ายเสมือน</w:t>
+      </w:r>
+    </w:p>
+    <w:p>
+      <w:pPr>
+        <w:keepNext w:val="0"/>
+        <w:keepLines w:val="0"/>
+        <w:spacing w:before="0" w:after="0" w:line="240" w:lineRule="auto"/>
+        <w:ind w:left="425" w:right="0" w:hanging="283"/>
+        <w:jc w:val="left"/>
+      </w:pPr>
+      <w:r>
+        <w:rPr>
+          <w:rFonts w:ascii="TH Sarabun New" w:hAnsi="TH Sarabun New" w:eastAsia="TH Sarabun New"/>
+          <w:b w:val="0"/>
+          <w:sz w:val="32"/>
+        </w:rPr>
+        <w:t xml:space="preserve">3. </w:t>
+      </w:r>
+      <w:r>
+        <w:rPr>
+          <w:rFonts w:ascii="TH Sarabun New" w:hAnsi="TH Sarabun New" w:eastAsia="TH Sarabun New"/>
+          <w:b w:val="0"/>
+          <w:sz w:val="32"/>
+        </w:rPr>
+        <w:t>ติดตั้งหรืออัปเดตไลบรารี</w:t>
+      </w:r>
+    </w:p>
+    <w:p>
+      <w:pPr>
+        <w:keepNext w:val="0"/>
+        <w:keepLines w:val="0"/>
+        <w:spacing w:before="0" w:after="0" w:line="240" w:lineRule="auto"/>
+        <w:ind w:left="425" w:right="0" w:hanging="283"/>
+        <w:jc w:val="left"/>
+      </w:pPr>
+      <w:r>
+        <w:rPr>
+          <w:rFonts w:ascii="TH Sarabun New" w:hAnsi="TH Sarabun New" w:eastAsia="TH Sarabun New"/>
+          <w:b w:val="0"/>
+          <w:sz w:val="32"/>
+        </w:rPr>
+        <w:t xml:space="preserve">4. </w:t>
+      </w:r>
+      <w:r>
+        <w:rPr>
+          <w:rFonts w:ascii="TH Sarabun New" w:hAnsi="TH Sarabun New" w:eastAsia="TH Sarabun New"/>
+          <w:b w:val="0"/>
+          <w:sz w:val="32"/>
+        </w:rPr>
+        <w:t>ปรับปรุงฐานข้อมูล (migrate)</w:t>
+      </w:r>
+    </w:p>
+    <w:p>
+      <w:pPr>
+        <w:keepNext w:val="0"/>
+        <w:keepLines w:val="0"/>
+        <w:spacing w:before="0" w:after="0" w:line="240" w:lineRule="auto"/>
+        <w:ind w:left="425" w:right="0" w:hanging="283"/>
+        <w:jc w:val="left"/>
+      </w:pPr>
+      <w:r>
+        <w:rPr>
+          <w:rFonts w:ascii="TH Sarabun New" w:hAnsi="TH Sarabun New" w:eastAsia="TH Sarabun New"/>
+          <w:b w:val="0"/>
+          <w:sz w:val="32"/>
+        </w:rPr>
+        <w:t xml:space="preserve">5. </w:t>
+      </w:r>
+      <w:r>
+        <w:rPr>
+          <w:rFonts w:ascii="TH Sarabun New" w:hAnsi="TH Sarabun New" w:eastAsia="TH Sarabun New"/>
+          <w:b w:val="0"/>
+          <w:sz w:val="32"/>
+        </w:rPr>
+        <w:t>รวบรวมไฟล์ static (collectstatic)</w:t>
+      </w:r>
+    </w:p>
+    <w:p>
+      <w:pPr>
+        <w:keepNext w:val="0"/>
+        <w:keepLines w:val="0"/>
+        <w:spacing w:before="0" w:after="0" w:line="240" w:lineRule="auto"/>
+        <w:ind w:left="425" w:right="0" w:hanging="283"/>
+        <w:jc w:val="left"/>
+      </w:pPr>
+      <w:r>
+        <w:rPr>
+          <w:rFonts w:ascii="TH Sarabun New" w:hAnsi="TH Sarabun New" w:eastAsia="TH Sarabun New"/>
+          <w:b w:val="0"/>
+          <w:sz w:val="32"/>
+        </w:rPr>
+        <w:t xml:space="preserve">6. </w:t>
+      </w:r>
+      <w:r>
+        <w:rPr>
+          <w:rFonts w:ascii="TH Sarabun New" w:hAnsi="TH Sarabun New" w:eastAsia="TH Sarabun New"/>
+          <w:b w:val="0"/>
+          <w:sz w:val="32"/>
+        </w:rPr>
+        <w:t>เริ่มบริการใหม่</w:t>
+      </w:r>
+    </w:p>
+    <w:p>
+      <w:pPr>
+        <w:keepNext w:val="0"/>
+        <w:keepLines w:val="0"/>
+        <w:spacing w:before="0" w:after="0" w:line="240" w:lineRule="auto"/>
+        <w:ind w:left="425" w:right="0" w:hanging="283"/>
+        <w:jc w:val="left"/>
+      </w:pPr>
+      <w:r>
+        <w:rPr>
+          <w:rFonts w:ascii="TH Sarabun New" w:hAnsi="TH Sarabun New" w:eastAsia="TH Sarabun New"/>
+          <w:b w:val="0"/>
+          <w:sz w:val="32"/>
+        </w:rPr>
+        <w:t xml:space="preserve">7. </w:t>
+      </w:r>
+      <w:r>
+        <w:rPr>
+          <w:rFonts w:ascii="TH Sarabun New" w:hAnsi="TH Sarabun New" w:eastAsia="TH Sarabun New"/>
+          <w:b w:val="0"/>
+          <w:sz w:val="32"/>
+        </w:rPr>
+        <w:t>ตรวจสอบสถานะบริการ</w:t>
+      </w:r>
+    </w:p>
+    <w:p>
+      <w:pPr>
+        <w:keepNext w:val="0"/>
+        <w:keepLines w:val="0"/>
+        <w:spacing w:before="0" w:after="0" w:line="240" w:lineRule="auto"/>
+        <w:ind w:left="0" w:right="0" w:firstLine="709"/>
+        <w:jc w:val="thaiDistribute"/>
+      </w:pPr>
+      <w:r>
+        <w:rPr>
+          <w:rFonts w:ascii="TH Sarabun New" w:hAnsi="TH Sarabun New" w:eastAsia="TH Sarabun New"/>
+          <w:b w:val="0"/>
+          <w:sz w:val="32"/>
+        </w:rPr>
+        <w:t>**การทดสอบหลัง deploy**</w:t>
+      </w:r>
+    </w:p>
+    <w:p>
+      <w:pPr>
+        <w:keepNext w:val="0"/>
+        <w:keepLines w:val="0"/>
+        <w:spacing w:before="0" w:after="0" w:line="240" w:lineRule="auto"/>
+        <w:ind w:left="0" w:right="0" w:firstLine="0"/>
+        <w:jc w:val="left"/>
+      </w:pPr>
+      <w:r>
+        <w:rPr>
+          <w:rFonts w:ascii="Courier New" w:hAnsi="Courier New" w:eastAsia="Courier New"/>
+          <w:b w:val="0"/>
+          <w:sz w:val="32"/>
+        </w:rPr>
+        <w:t>BASE_URL=https://mcotequipmentservices.mcot.net ./scripts/smoke_test.sh</w:t>
+      </w:r>
+    </w:p>
+    <w:p>
+      <w:pPr>
+        <w:keepNext w:val="0"/>
+        <w:keepLines w:val="0"/>
+        <w:spacing w:before="0" w:after="0" w:line="240" w:lineRule="auto"/>
+        <w:ind w:left="0" w:right="0" w:firstLine="709"/>
+        <w:jc w:val="thaiDistribute"/>
+      </w:pPr>
+      <w:r>
+        <w:rPr>
+          <w:rFonts w:ascii="TH Sarabun New" w:hAnsi="TH Sarabun New" w:eastAsia="TH Sarabun New"/>
+          <w:b w:val="0"/>
+          <w:sz w:val="32"/>
+        </w:rPr>
+        <w:t>ตรวจสอบ:</w:t>
+      </w:r>
+    </w:p>
+    <w:p>
+      <w:pPr>
+        <w:keepNext w:val="0"/>
+        <w:keepLines w:val="0"/>
+        <w:spacing w:before="0" w:after="0" w:line="240" w:lineRule="auto"/>
+        <w:ind w:left="425" w:right="0" w:hanging="283"/>
+        <w:jc w:val="left"/>
+      </w:pPr>
+      <w:r>
+        <w:rPr>
+          <w:rFonts w:ascii="TH Sarabun New" w:hAnsi="TH Sarabun New" w:eastAsia="TH Sarabun New"/>
+          <w:b w:val="0"/>
+          <w:sz w:val="32"/>
+        </w:rPr>
+        <w:t>หน้าแรกเข้าได้ปกติ</w:t>
+      </w:r>
+    </w:p>
+    <w:p>
+      <w:pPr>
+        <w:keepNext w:val="0"/>
+        <w:keepLines w:val="0"/>
+        <w:spacing w:before="0" w:after="0" w:line="240" w:lineRule="auto"/>
+        <w:ind w:left="425" w:right="0" w:hanging="283"/>
+        <w:jc w:val="left"/>
+      </w:pPr>
+      <w:r>
+        <w:rPr>
+          <w:rFonts w:ascii="TH Sarabun New" w:hAnsi="TH Sarabun New" w:eastAsia="TH Sarabun New"/>
+          <w:b w:val="0"/>
+          <w:sz w:val="32"/>
+        </w:rPr>
+        <w:t>หน้าแคตตาล็อกโหลดได้</w:t>
+      </w:r>
+    </w:p>
+    <w:p>
+      <w:pPr>
+        <w:keepNext w:val="0"/>
+        <w:keepLines w:val="0"/>
+        <w:spacing w:before="0" w:after="0" w:line="240" w:lineRule="auto"/>
+        <w:ind w:left="425" w:right="0" w:hanging="283"/>
+        <w:jc w:val="left"/>
+      </w:pPr>
+      <w:r>
+        <w:rPr>
+          <w:rFonts w:ascii="TH Sarabun New" w:hAnsi="TH Sarabun New" w:eastAsia="TH Sarabun New"/>
+          <w:b w:val="0"/>
+          <w:sz w:val="32"/>
+        </w:rPr>
+        <w:t>หน้าล็อกอินและรายการจองทำงานตามปกติ</w:t>
+      </w:r>
+    </w:p>
+    <w:p>
+      <w:pPr>
+        <w:keepNext w:val="0"/>
+        <w:keepLines w:val="0"/>
+        <w:spacing w:before="0" w:after="0" w:line="240" w:lineRule="auto"/>
+        <w:ind w:left="425" w:right="0" w:hanging="283"/>
+        <w:jc w:val="left"/>
+      </w:pPr>
+      <w:r>
+        <w:rPr>
+          <w:rFonts w:ascii="TH Sarabun New" w:hAnsi="TH Sarabun New" w:eastAsia="TH Sarabun New"/>
+          <w:b w:val="0"/>
+          <w:sz w:val="32"/>
+        </w:rPr>
+        <w:t>ระบบแจ้งเตือนตอบสนองได้</w:t>
+      </w:r>
+    </w:p>
+    <w:p>
+      <w:pPr>
+        <w:keepNext w:val="0"/>
+        <w:keepLines w:val="0"/>
+        <w:spacing w:before="0" w:after="0" w:line="240" w:lineRule="auto"/>
+        <w:ind w:left="0" w:right="0" w:firstLine="709"/>
+        <w:jc w:val="thaiDistribute"/>
+      </w:pPr>
+      <w:r>
+        <w:rPr>
+          <w:rFonts w:ascii="TH Sarabun New" w:hAnsi="TH Sarabun New" w:eastAsia="TH Sarabun New"/>
+          <w:b w:val="0"/>
+          <w:sz w:val="32"/>
+        </w:rPr>
+        <w:t>**การตรวจสุขภาพเซิร์ฟเวอร์**</w:t>
+      </w:r>
+    </w:p>
+    <w:p>
+      <w:pPr>
+        <w:keepNext w:val="0"/>
+        <w:keepLines w:val="0"/>
+        <w:spacing w:before="0" w:after="0" w:line="240" w:lineRule="auto"/>
+        <w:ind w:left="0" w:right="0" w:firstLine="0"/>
+        <w:jc w:val="left"/>
+      </w:pPr>
+      <w:r>
+        <w:rPr>
+          <w:rFonts w:ascii="Courier New" w:hAnsi="Courier New" w:eastAsia="Courier New"/>
+          <w:b w:val="0"/>
+          <w:sz w:val="32"/>
+        </w:rPr>
+        <w:t>./scripts/health_check_vps.sh</w:t>
+      </w:r>
+    </w:p>
+    <w:p>
+      <w:pPr>
+        <w:keepNext w:val="0"/>
+        <w:keepLines w:val="0"/>
+        <w:spacing w:before="0" w:after="0" w:line="240" w:lineRule="auto"/>
+        <w:ind w:left="0" w:right="0" w:firstLine="709"/>
+        <w:jc w:val="thaiDistribute"/>
+      </w:pPr>
+      <w:r>
+        <w:rPr>
+          <w:rFonts w:ascii="TH Sarabun New" w:hAnsi="TH Sarabun New" w:eastAsia="TH Sarabun New"/>
+          <w:b w:val="0"/>
+          <w:sz w:val="32"/>
+        </w:rPr>
+        <w:t>ตรวจ:</w:t>
+      </w:r>
+    </w:p>
+    <w:p>
+      <w:pPr>
+        <w:keepNext w:val="0"/>
+        <w:keepLines w:val="0"/>
+        <w:spacing w:before="0" w:after="0" w:line="240" w:lineRule="auto"/>
+        <w:ind w:left="425" w:right="0" w:hanging="283"/>
+        <w:jc w:val="left"/>
+      </w:pPr>
+      <w:r>
+        <w:rPr>
+          <w:rFonts w:ascii="TH Sarabun New" w:hAnsi="TH Sarabun New" w:eastAsia="TH Sarabun New"/>
+          <w:b w:val="0"/>
+          <w:sz w:val="32"/>
+        </w:rPr>
+        <w:t>สถานะบริการหลัก (gunicorn)</w:t>
+      </w:r>
+    </w:p>
+    <w:p>
+      <w:pPr>
+        <w:keepNext w:val="0"/>
+        <w:keepLines w:val="0"/>
+        <w:spacing w:before="0" w:after="0" w:line="240" w:lineRule="auto"/>
+        <w:ind w:left="425" w:right="0" w:hanging="283"/>
+        <w:jc w:val="left"/>
+      </w:pPr>
+      <w:r>
+        <w:rPr>
+          <w:rFonts w:ascii="TH Sarabun New" w:hAnsi="TH Sarabun New" w:eastAsia="TH Sarabun New"/>
+          <w:b w:val="0"/>
+          <w:sz w:val="32"/>
+        </w:rPr>
+        <w:t>การตอบสนองของเว็บไซต์</w:t>
+      </w:r>
+    </w:p>
+    <w:p>
+      <w:pPr>
+        <w:keepNext w:val="0"/>
+        <w:keepLines w:val="0"/>
+        <w:spacing w:before="0" w:after="0" w:line="240" w:lineRule="auto"/>
+        <w:ind w:left="425" w:right="0" w:hanging="283"/>
+        <w:jc w:val="left"/>
+      </w:pPr>
+      <w:r>
+        <w:rPr>
+          <w:rFonts w:ascii="TH Sarabun New" w:hAnsi="TH Sarabun New" w:eastAsia="TH Sarabun New"/>
+          <w:b w:val="0"/>
+          <w:sz w:val="32"/>
+        </w:rPr>
+        <w:t>สถานะพื้นที่จัดเก็บและระบบปกติ</w:t>
+      </w:r>
+    </w:p>
+    <w:p>
+      <w:pPr>
+        <w:keepNext w:val="0"/>
+        <w:keepLines w:val="0"/>
+        <w:spacing w:before="0" w:after="0" w:line="240" w:lineRule="auto"/>
+        <w:ind w:left="0" w:right="0" w:firstLine="709"/>
+        <w:jc w:val="thaiDistribute"/>
+      </w:pPr>
+      <w:r>
+        <w:rPr>
+          <w:rFonts w:ascii="TH Sarabun New" w:hAnsi="TH Sarabun New" w:eastAsia="TH Sarabun New"/>
+          <w:b w:val="0"/>
+          <w:sz w:val="32"/>
+        </w:rPr>
+        <w:t>**การกู้คืนข้อมูลในกรณีฉุกเฉิน**</w:t>
+      </w:r>
+    </w:p>
+    <w:p>
+      <w:pPr>
+        <w:keepNext w:val="0"/>
+        <w:keepLines w:val="0"/>
+        <w:spacing w:before="0" w:after="0" w:line="240" w:lineRule="auto"/>
+        <w:ind w:left="0" w:right="0" w:firstLine="709"/>
+        <w:jc w:val="thaiDistribute"/>
+      </w:pPr>
+      <w:r>
+        <w:rPr>
+          <w:rFonts w:ascii="TH Sarabun New" w:hAnsi="TH Sarabun New" w:eastAsia="TH Sarabun New"/>
+          <w:b w:val="0"/>
+          <w:sz w:val="32"/>
+        </w:rPr>
+        <w:t>ทดสอบ dry run:</w:t>
+      </w:r>
+    </w:p>
+    <w:p>
+      <w:pPr>
+        <w:keepNext w:val="0"/>
+        <w:keepLines w:val="0"/>
+        <w:spacing w:before="0" w:after="0" w:line="240" w:lineRule="auto"/>
+        <w:ind w:left="0" w:right="0" w:firstLine="0"/>
+        <w:jc w:val="left"/>
+      </w:pPr>
+      <w:r>
+        <w:rPr>
+          <w:rFonts w:ascii="Courier New" w:hAnsi="Courier New" w:eastAsia="Courier New"/>
+          <w:b w:val="0"/>
+          <w:sz w:val="32"/>
+        </w:rPr>
+        <w:t>CONFIRM_RESTORE=YES DRY_RUN=1 ./scripts/db_restore.sh backups/postgres/&lt;file&gt;.sql.gz</w:t>
+      </w:r>
+    </w:p>
+    <w:p>
+      <w:pPr>
+        <w:keepNext w:val="0"/>
+        <w:keepLines w:val="0"/>
+        <w:spacing w:before="0" w:after="0" w:line="240" w:lineRule="auto"/>
+        <w:ind w:left="0" w:right="0" w:firstLine="709"/>
+        <w:jc w:val="thaiDistribute"/>
+      </w:pPr>
+      <w:r>
+        <w:rPr>
+          <w:rFonts w:ascii="TH Sarabun New" w:hAnsi="TH Sarabun New" w:eastAsia="TH Sarabun New"/>
+          <w:b w:val="0"/>
+          <w:sz w:val="32"/>
+        </w:rPr>
+        <w:t>กู้คืนจริง:</w:t>
+      </w:r>
+    </w:p>
+    <w:p>
+      <w:pPr>
+        <w:keepNext w:val="0"/>
+        <w:keepLines w:val="0"/>
+        <w:spacing w:before="0" w:after="0" w:line="240" w:lineRule="auto"/>
+        <w:ind w:left="0" w:right="0" w:firstLine="0"/>
+        <w:jc w:val="left"/>
+      </w:pPr>
+      <w:r>
+        <w:rPr>
+          <w:rFonts w:ascii="Courier New" w:hAnsi="Courier New" w:eastAsia="Courier New"/>
+          <w:b w:val="0"/>
+          <w:sz w:val="32"/>
+        </w:rPr>
+        <w:t>CONFIRM_RESTORE=YES ./scripts/db_restore.sh backups/postgres/&lt;file&gt;.sql.gz</w:t>
+      </w:r>
+    </w:p>
+    <w:p>
+      <w:pPr>
+        <w:keepNext w:val="0"/>
+        <w:keepLines w:val="0"/>
+        <w:spacing w:before="0" w:after="0" w:line="240" w:lineRule="auto"/>
+        <w:ind w:left="0" w:right="0" w:firstLine="709"/>
+        <w:jc w:val="thaiDistribute"/>
+      </w:pPr>
+      <w:r>
+        <w:rPr>
+          <w:rFonts w:ascii="TH Sarabun New" w:hAnsi="TH Sarabun New" w:eastAsia="TH Sarabun New"/>
+          <w:b w:val="0"/>
+          <w:sz w:val="32"/>
+        </w:rPr>
+        <w:t>ข้อระวัง:</w:t>
+      </w:r>
+    </w:p>
+    <w:p>
+      <w:pPr>
+        <w:keepNext w:val="0"/>
+        <w:keepLines w:val="0"/>
+        <w:spacing w:before="0" w:after="0" w:line="240" w:lineRule="auto"/>
+        <w:ind w:left="425" w:right="0" w:hanging="283"/>
+        <w:jc w:val="left"/>
+      </w:pPr>
+      <w:r>
+        <w:rPr>
+          <w:rFonts w:ascii="TH Sarabun New" w:hAnsi="TH Sarabun New" w:eastAsia="TH Sarabun New"/>
+          <w:b w:val="0"/>
+          <w:sz w:val="32"/>
+        </w:rPr>
+        <w:t>ตรวจสอบไฟล์สำรองถูกต้องก่อน</w:t>
+      </w:r>
+    </w:p>
+    <w:p>
+      <w:pPr>
+        <w:keepNext w:val="0"/>
+        <w:keepLines w:val="0"/>
+        <w:spacing w:before="0" w:after="0" w:line="240" w:lineRule="auto"/>
+        <w:ind w:left="425" w:right="0" w:hanging="283"/>
+        <w:jc w:val="left"/>
+      </w:pPr>
+      <w:r>
+        <w:rPr>
+          <w:rFonts w:ascii="TH Sarabun New" w:hAnsi="TH Sarabun New" w:eastAsia="TH Sarabun New"/>
+          <w:b w:val="0"/>
+          <w:sz w:val="32"/>
+        </w:rPr>
+        <w:t>ลดหรือหยุดการใช้งานระบบชั่วคราว</w:t>
+      </w:r>
+    </w:p>
+    <w:p>
+      <w:pPr>
+        <w:keepNext w:val="0"/>
+        <w:keepLines w:val="0"/>
+        <w:spacing w:before="0" w:after="0" w:line="240" w:lineRule="auto"/>
+        <w:ind w:left="425" w:right="0" w:hanging="283"/>
+        <w:jc w:val="left"/>
+      </w:pPr>
+      <w:r>
+        <w:rPr>
+          <w:rFonts w:ascii="TH Sarabun New" w:hAnsi="TH Sarabun New" w:eastAsia="TH Sarabun New"/>
+          <w:b w:val="0"/>
+          <w:sz w:val="32"/>
+        </w:rPr>
+        <w:t>บันทึกเหตุการณ์และผลการกู้คืน</w:t>
+      </w:r>
+    </w:p>
+    <w:p>
+      <w:pPr>
+        <w:keepNext/>
+        <w:keepLines w:val="0"/>
+        <w:spacing w:before="80" w:after="40" w:line="240" w:lineRule="auto"/>
+        <w:ind w:left="425" w:right="0" w:firstLine="0"/>
+        <w:jc w:val="left"/>
+      </w:pPr>
+      <w:r>
+        <w:rPr>
+          <w:rFonts w:ascii="TH Sarabun New" w:hAnsi="TH Sarabun New" w:eastAsia="TH Sarabun New"/>
+          <w:b/>
+          <w:sz w:val="32"/>
+        </w:rPr>
+        <w:t>ช.6 กฎการใช้งานและนโยบาย</w:t>
+      </w:r>
+    </w:p>
+    <w:p>
+      <w:pPr>
+        <w:keepNext w:val="0"/>
+        <w:keepLines w:val="0"/>
+        <w:spacing w:before="0" w:after="0" w:line="240" w:lineRule="auto"/>
+        <w:ind w:left="425" w:right="0" w:hanging="283"/>
+        <w:jc w:val="left"/>
+      </w:pPr>
+      <w:r>
+        <w:rPr>
+          <w:rFonts w:ascii="TH Sarabun New" w:hAnsi="TH Sarabun New" w:eastAsia="TH Sarabun New"/>
+          <w:b w:val="0"/>
+          <w:sz w:val="32"/>
+        </w:rPr>
+        <w:t xml:space="preserve">1. </w:t>
+      </w:r>
+      <w:r>
+        <w:rPr>
+          <w:rFonts w:ascii="TH Sarabun New" w:hAnsi="TH Sarabun New" w:eastAsia="TH Sarabun New"/>
+          <w:b w:val="0"/>
+          <w:sz w:val="32"/>
+        </w:rPr>
+        <w:t>ผู้ใช้งานต้องกรอกข้อมูลให้ถูกต้องและครบถ้วนก่อนยืนยันรายการจอง</w:t>
+      </w:r>
+    </w:p>
+    <w:p>
+      <w:pPr>
+        <w:keepNext w:val="0"/>
+        <w:keepLines w:val="0"/>
+        <w:spacing w:before="0" w:after="0" w:line="240" w:lineRule="auto"/>
+        <w:ind w:left="425" w:right="0" w:hanging="283"/>
+        <w:jc w:val="left"/>
+      </w:pPr>
+      <w:r>
+        <w:rPr>
+          <w:rFonts w:ascii="TH Sarabun New" w:hAnsi="TH Sarabun New" w:eastAsia="TH Sarabun New"/>
+          <w:b w:val="0"/>
+          <w:sz w:val="32"/>
+        </w:rPr>
+        <w:t xml:space="preserve">2. </w:t>
+      </w:r>
+      <w:r>
+        <w:rPr>
+          <w:rFonts w:ascii="TH Sarabun New" w:hAnsi="TH Sarabun New" w:eastAsia="TH Sarabun New"/>
+          <w:b w:val="0"/>
+          <w:sz w:val="32"/>
+        </w:rPr>
+        <w:t>การอนุมัติรายการขึ้นอยู่กับการตรวจสอบของเจ้าหน้าที่</w:t>
+      </w:r>
+    </w:p>
+    <w:p>
+      <w:pPr>
+        <w:keepNext w:val="0"/>
+        <w:keepLines w:val="0"/>
+        <w:spacing w:before="0" w:after="0" w:line="240" w:lineRule="auto"/>
+        <w:ind w:left="425" w:right="0" w:hanging="283"/>
+        <w:jc w:val="left"/>
+      </w:pPr>
+      <w:r>
+        <w:rPr>
+          <w:rFonts w:ascii="TH Sarabun New" w:hAnsi="TH Sarabun New" w:eastAsia="TH Sarabun New"/>
+          <w:b w:val="0"/>
+          <w:sz w:val="32"/>
+        </w:rPr>
+        <w:t xml:space="preserve">3. </w:t>
+      </w:r>
+      <w:r>
+        <w:rPr>
+          <w:rFonts w:ascii="TH Sarabun New" w:hAnsi="TH Sarabun New" w:eastAsia="TH Sarabun New"/>
+          <w:b w:val="0"/>
+          <w:sz w:val="32"/>
+        </w:rPr>
+        <w:t>รายการที่คืนเกินกำหนดอาจมีค่าปรับตามกติกา</w:t>
+      </w:r>
+    </w:p>
+    <w:p>
+      <w:pPr>
+        <w:keepNext w:val="0"/>
+        <w:keepLines w:val="0"/>
+        <w:spacing w:before="0" w:after="0" w:line="240" w:lineRule="auto"/>
+        <w:ind w:left="425" w:right="0" w:hanging="283"/>
+        <w:jc w:val="left"/>
+      </w:pPr>
+      <w:r>
+        <w:rPr>
+          <w:rFonts w:ascii="TH Sarabun New" w:hAnsi="TH Sarabun New" w:eastAsia="TH Sarabun New"/>
+          <w:b w:val="0"/>
+          <w:sz w:val="32"/>
+        </w:rPr>
+        <w:t xml:space="preserve">4. </w:t>
+      </w:r>
+      <w:r>
+        <w:rPr>
+          <w:rFonts w:ascii="TH Sarabun New" w:hAnsi="TH Sarabun New" w:eastAsia="TH Sarabun New"/>
+          <w:b w:val="0"/>
+          <w:sz w:val="32"/>
+        </w:rPr>
+        <w:t>ระบบกันคิวซ้อนทับตามช่วงเวลาและทรัพยากรโดยอัตโนมัติ</w:t>
+      </w:r>
+    </w:p>
+    <w:p>
+      <w:pPr>
+        <w:keepNext w:val="0"/>
+        <w:keepLines w:val="0"/>
+        <w:spacing w:before="0" w:after="0" w:line="240" w:lineRule="auto"/>
+        <w:ind w:left="425" w:right="0" w:hanging="283"/>
+        <w:jc w:val="left"/>
+      </w:pPr>
+      <w:r>
+        <w:rPr>
+          <w:rFonts w:ascii="TH Sarabun New" w:hAnsi="TH Sarabun New" w:eastAsia="TH Sarabun New"/>
+          <w:b w:val="0"/>
+          <w:sz w:val="32"/>
+        </w:rPr>
+        <w:t xml:space="preserve">5. </w:t>
+      </w:r>
+      <w:r>
+        <w:rPr>
+          <w:rFonts w:ascii="TH Sarabun New" w:hAnsi="TH Sarabun New" w:eastAsia="TH Sarabun New"/>
+          <w:b w:val="0"/>
+          <w:sz w:val="32"/>
+        </w:rPr>
+        <w:t>บางเมนูสงวนสิทธิ์สำหรับเจ้าหน้าที่หรือผู้ดูแลระบบเท่านั้น</w:t>
+      </w:r>
+    </w:p>
+    <w:p>
+      <w:pPr>
+        <w:keepNext/>
+        <w:keepLines w:val="0"/>
+        <w:spacing w:before="80" w:after="40" w:line="240" w:lineRule="auto"/>
+        <w:ind w:left="425" w:right="0" w:firstLine="0"/>
+        <w:jc w:val="left"/>
+      </w:pPr>
+      <w:r>
+        <w:rPr>
+          <w:rFonts w:ascii="TH Sarabun New" w:hAnsi="TH Sarabun New" w:eastAsia="TH Sarabun New"/>
+          <w:b/>
+          <w:sz w:val="32"/>
+        </w:rPr>
+        <w:t>ช.7 คำถามที่พบบ่อย</w:t>
+      </w:r>
+    </w:p>
+    <w:p>
+      <w:pPr>
+        <w:keepNext w:val="0"/>
+        <w:keepLines w:val="0"/>
+        <w:spacing w:before="0" w:after="0" w:line="240" w:lineRule="auto"/>
+        <w:ind w:left="425" w:right="0" w:hanging="283"/>
+        <w:jc w:val="left"/>
+      </w:pPr>
+      <w:r>
+        <w:rPr>
+          <w:rFonts w:ascii="TH Sarabun New" w:hAnsi="TH Sarabun New" w:eastAsia="TH Sarabun New"/>
+          <w:b w:val="0"/>
+          <w:sz w:val="32"/>
+        </w:rPr>
+        <w:t>**เพิ่มสินค้าเข้าตะกร้าไม่ได้**: อาจเป็นเพราะสินค้าหมด ไม่พร้อมใช้งาน หรือเลยสต็อก</w:t>
+      </w:r>
+    </w:p>
+    <w:p>
+      <w:pPr>
+        <w:keepNext w:val="0"/>
+        <w:keepLines w:val="0"/>
+        <w:spacing w:before="0" w:after="0" w:line="240" w:lineRule="auto"/>
+        <w:ind w:left="425" w:right="0" w:hanging="283"/>
+        <w:jc w:val="left"/>
+      </w:pPr>
+      <w:r>
+        <w:rPr>
+          <w:rFonts w:ascii="TH Sarabun New" w:hAnsi="TH Sarabun New" w:eastAsia="TH Sarabun New"/>
+          <w:b w:val="0"/>
+          <w:sz w:val="32"/>
+        </w:rPr>
+        <w:t>**ยืนยันการจองไม่ได้**: ตรวจสอบวันใช้งาน ข้อมูลติดต่อ และรายการไม่มีชน</w:t>
+      </w:r>
+    </w:p>
+    <w:p>
+      <w:pPr>
+        <w:keepNext w:val="0"/>
+        <w:keepLines w:val="0"/>
+        <w:spacing w:before="0" w:after="0" w:line="240" w:lineRule="auto"/>
+        <w:ind w:left="425" w:right="0" w:hanging="283"/>
+        <w:jc w:val="left"/>
+      </w:pPr>
+      <w:r>
+        <w:rPr>
+          <w:rFonts w:ascii="TH Sarabun New" w:hAnsi="TH Sarabun New" w:eastAsia="TH Sarabun New"/>
+          <w:b w:val="0"/>
+          <w:sz w:val="32"/>
+        </w:rPr>
+        <w:t>**แนบสลิปแล้วแต่สถานะไม่เปลี่ยน**: จะเปลี่ยนหลังเจ้าหน้าที่ตรวจสอบ</w:t>
+      </w:r>
+    </w:p>
+    <w:p>
+      <w:pPr>
+        <w:keepNext w:val="0"/>
+        <w:keepLines w:val="0"/>
+        <w:spacing w:before="0" w:after="0" w:line="240" w:lineRule="auto"/>
+        <w:ind w:left="425" w:right="0" w:hanging="283"/>
+        <w:jc w:val="left"/>
+      </w:pPr>
+      <w:r>
+        <w:rPr>
+          <w:rFonts w:ascii="TH Sarabun New" w:hAnsi="TH Sarabun New" w:eastAsia="TH Sarabun New"/>
+          <w:b w:val="0"/>
+          <w:sz w:val="32"/>
+        </w:rPr>
+        <w:t>**ลืมรหัสผ่าน**: ใช้เมนูรีเซ็ตรหัสผ่านจากหน้าล็อกอิน</w:t>
+      </w:r>
+    </w:p>
+    <w:p>
+      <w:pPr>
+        <w:keepNext w:val="0"/>
+        <w:keepLines w:val="0"/>
+        <w:spacing w:before="0" w:after="0" w:line="240" w:lineRule="auto"/>
+        <w:ind w:left="425" w:right="0" w:hanging="283"/>
+        <w:jc w:val="left"/>
+      </w:pPr>
+      <w:r>
+        <w:rPr>
+          <w:rFonts w:ascii="TH Sarabun New" w:hAnsi="TH Sarabun New" w:eastAsia="TH Sarabun New"/>
+          <w:b w:val="0"/>
+          <w:sz w:val="32"/>
+        </w:rPr>
+        <w:t>**deploy แล้วพบปัญหา**: ประเมิน rollback โค้ด หรือกู้คืนข้อมูลเฉพาะเมื่อจำเป็น</w:t>
+      </w:r>
+    </w:p>
+    <w:p>
+      <w:pPr>
+        <w:keepNext/>
+        <w:keepLines w:val="0"/>
+        <w:spacing w:before="80" w:after="40" w:line="240" w:lineRule="auto"/>
+        <w:ind w:left="425" w:right="0" w:firstLine="0"/>
+        <w:jc w:val="left"/>
+      </w:pPr>
+      <w:r>
+        <w:rPr>
+          <w:rFonts w:ascii="TH Sarabun New" w:hAnsi="TH Sarabun New" w:eastAsia="TH Sarabun New"/>
+          <w:b/>
+          <w:sz w:val="32"/>
+        </w:rPr>
+        <w:t>ช.8 ช่องทางติดต่อและอ้างอิง</w:t>
+      </w:r>
+    </w:p>
+    <w:p>
+      <w:pPr>
+        <w:keepNext w:val="0"/>
+        <w:keepLines w:val="0"/>
+        <w:spacing w:before="0" w:after="0" w:line="240" w:lineRule="auto"/>
+        <w:ind w:left="0" w:right="0" w:firstLine="709"/>
+        <w:jc w:val="thaiDistribute"/>
+      </w:pPr>
+      <w:r>
+        <w:rPr>
+          <w:rFonts w:ascii="TH Sarabun New" w:hAnsi="TH Sarabun New" w:eastAsia="TH Sarabun New"/>
+          <w:b w:val="0"/>
+          <w:sz w:val="32"/>
+        </w:rPr>
+        <w:t>ให้เพิ่มเติมข้อมูลติดต่อจริงก่อนส่งมอบใช้งาน:</w:t>
+      </w:r>
+    </w:p>
+    <w:p>
+      <w:pPr>
+        <w:keepNext w:val="0"/>
+        <w:keepLines w:val="0"/>
+        <w:spacing w:before="0" w:after="0" w:line="240" w:lineRule="auto"/>
+        <w:ind w:left="425" w:right="0" w:hanging="283"/>
+        <w:jc w:val="left"/>
+      </w:pPr>
+      <w:r>
+        <w:rPr>
+          <w:rFonts w:ascii="TH Sarabun New" w:hAnsi="TH Sarabun New" w:eastAsia="TH Sarabun New"/>
+          <w:b w:val="0"/>
+          <w:sz w:val="32"/>
+        </w:rPr>
+        <w:t>ทีม IT Support</w:t>
+      </w:r>
+    </w:p>
+    <w:p>
+      <w:pPr>
+        <w:keepNext w:val="0"/>
+        <w:keepLines w:val="0"/>
+        <w:spacing w:before="0" w:after="0" w:line="240" w:lineRule="auto"/>
+        <w:ind w:left="425" w:right="0" w:hanging="283"/>
+        <w:jc w:val="left"/>
+      </w:pPr>
+      <w:r>
+        <w:rPr>
+          <w:rFonts w:ascii="TH Sarabun New" w:hAnsi="TH Sarabun New" w:eastAsia="TH Sarabun New"/>
+          <w:b w:val="0"/>
+          <w:sz w:val="32"/>
+        </w:rPr>
+        <w:t>โทรภายใน</w:t>
+      </w:r>
+    </w:p>
+    <w:p>
+      <w:pPr>
+        <w:keepNext w:val="0"/>
+        <w:keepLines w:val="0"/>
+        <w:spacing w:before="0" w:after="0" w:line="240" w:lineRule="auto"/>
+        <w:ind w:left="425" w:right="0" w:hanging="283"/>
+        <w:jc w:val="left"/>
+      </w:pPr>
+      <w:r>
+        <w:rPr>
+          <w:rFonts w:ascii="TH Sarabun New" w:hAnsi="TH Sarabun New" w:eastAsia="TH Sarabun New"/>
+          <w:b w:val="0"/>
+          <w:sz w:val="32"/>
+        </w:rPr>
+        <w:t>ผู้ประสานงานหน่วยงาน</w:t>
       </w:r>
     </w:p>
     <w:p>

</xml_diff>